<commit_message>
docs: agregar sección 12 — Métricas y KPIs para seguimiento de campañas
CPL, CVR, CTR, Quality Score, semáforo de rendimiento, frecuencia
de revisión, dashboard recomendado, vinculación GA4 y modelo de
reporte mensual.

Co-Authored-By: Claude Sonnet 4.6 <noreply@anthropic.com>
</commit_message>
<xml_diff>
--- a/Campanas_GoogleAds_SistemasYSoluciones.docx
+++ b/Campanas_GoogleAds_SistemasYSoluciones.docx
@@ -22347,6 +22347,3197 @@
       </w:tr>
     </w:tbl>
     <w:p/>
+    <w:p>
+      <w:r>
+        <w:br w:type="page"/>
+      </w:r>
+    </w:p>
+    <w:p>
+      <w:pPr>
+        <w:spacing w:before="360" w:after="80"/>
+      </w:pPr>
+      <w:r>
+        <w:rPr>
+          <w:b/>
+          <w:color w:val="FF9B11"/>
+          <w:sz w:val="32"/>
+        </w:rPr>
+        <w:t>12. MÉTRICAS Y KPIS PARA SEGUIMIENTO DE CAMPAÑAS</w:t>
+      </w:r>
+    </w:p>
+    <w:p>
+      <w:pPr>
+        <w:spacing w:after="40"/>
+      </w:pPr>
+      <w:r>
+        <w:rPr>
+          <w:b w:val="0"/>
+          <w:i w:val="0"/>
+          <w:sz w:val="20"/>
+        </w:rPr>
+        <w:t>Esta sección define qué medir, con qué frecuencia, qué valores son aceptables y cuándo tomar acción correctiva en cada campaña.</w:t>
+      </w:r>
+    </w:p>
+    <w:p/>
+    <w:p>
+      <w:pPr>
+        <w:spacing w:before="280" w:after="60"/>
+      </w:pPr>
+      <w:r>
+        <w:rPr>
+          <w:b/>
+          <w:color w:val="505050"/>
+          <w:sz w:val="26"/>
+        </w:rPr>
+        <w:t>12.1  KPIs primarios — Lo que determina el éxito</w:t>
+      </w:r>
+    </w:p>
+    <w:tbl>
+      <w:tblPr>
+        <w:tblStyle w:val="Tablaconcuadrcula"/>
+        <w:tblW w:type="auto" w:w="0"/>
+        <w:jc w:val="left"/>
+        <w:tblLook w:firstColumn="1" w:firstRow="1" w:lastColumn="0" w:lastRow="0" w:noHBand="0" w:noVBand="1" w:val="04A0"/>
+      </w:tblPr>
+      <w:tblGrid>
+        <w:gridCol w:w="2351"/>
+        <w:gridCol w:w="2351"/>
+        <w:gridCol w:w="2351"/>
+        <w:gridCol w:w="2351"/>
+      </w:tblGrid>
+      <w:tr>
+        <w:tc>
+          <w:tcPr>
+            <w:tcW w:type="dxa" w:w="2268"/>
+            <w:shd w:val="clear" w:color="auto" w:fill="505050"/>
+          </w:tcPr>
+          <w:p>
+            <w:pPr>
+              <w:jc w:val="center"/>
+            </w:pPr>
+            <w:r>
+              <w:rPr>
+                <w:b/>
+                <w:color w:val="FFFFFF"/>
+                <w:sz w:val="18"/>
+              </w:rPr>
+              <w:t>KPI</w:t>
+            </w:r>
+          </w:p>
+        </w:tc>
+        <w:tc>
+          <w:tcPr>
+            <w:tcW w:type="dxa" w:w="3402"/>
+            <w:shd w:val="clear" w:color="auto" w:fill="505050"/>
+          </w:tcPr>
+          <w:p>
+            <w:pPr>
+              <w:jc w:val="center"/>
+            </w:pPr>
+            <w:r>
+              <w:rPr>
+                <w:b/>
+                <w:color w:val="FFFFFF"/>
+                <w:sz w:val="18"/>
+              </w:rPr>
+              <w:t>Definición</w:t>
+            </w:r>
+          </w:p>
+        </w:tc>
+        <w:tc>
+          <w:tcPr>
+            <w:tcW w:type="dxa" w:w="2268"/>
+            <w:shd w:val="clear" w:color="auto" w:fill="505050"/>
+          </w:tcPr>
+          <w:p>
+            <w:pPr>
+              <w:jc w:val="center"/>
+            </w:pPr>
+            <w:r>
+              <w:rPr>
+                <w:b/>
+                <w:color w:val="FFFFFF"/>
+                <w:sz w:val="18"/>
+              </w:rPr>
+              <w:t>Objetivo</w:t>
+            </w:r>
+          </w:p>
+        </w:tc>
+        <w:tc>
+          <w:tcPr>
+            <w:tcW w:type="dxa" w:w="2835"/>
+            <w:shd w:val="clear" w:color="auto" w:fill="505050"/>
+          </w:tcPr>
+          <w:p>
+            <w:pPr>
+              <w:jc w:val="center"/>
+            </w:pPr>
+            <w:r>
+              <w:rPr>
+                <w:b/>
+                <w:color w:val="FFFFFF"/>
+                <w:sz w:val="18"/>
+              </w:rPr>
+              <w:t>Alerta</w:t>
+            </w:r>
+          </w:p>
+        </w:tc>
+      </w:tr>
+      <w:tr>
+        <w:tc>
+          <w:tcPr>
+            <w:tcW w:type="dxa" w:w="2268"/>
+            <w:shd w:val="clear" w:color="auto" w:fill="F5F5F5"/>
+          </w:tcPr>
+          <w:p>
+            <w:r>
+              <w:rPr>
+                <w:sz w:val="18"/>
+              </w:rPr>
+              <w:t>Costo por Lead (CPL)</w:t>
+            </w:r>
+          </w:p>
+        </w:tc>
+        <w:tc>
+          <w:tcPr>
+            <w:tcW w:type="dxa" w:w="3402"/>
+            <w:shd w:val="clear" w:color="auto" w:fill="F5F5F5"/>
+          </w:tcPr>
+          <w:p>
+            <w:r>
+              <w:rPr>
+                <w:sz w:val="18"/>
+              </w:rPr>
+              <w:t>Gasto total ÷ cantidad de conversiones (formularios + WhatsApp)</w:t>
+            </w:r>
+          </w:p>
+        </w:tc>
+        <w:tc>
+          <w:tcPr>
+            <w:tcW w:type="dxa" w:w="2268"/>
+            <w:shd w:val="clear" w:color="auto" w:fill="F5F5F5"/>
+          </w:tcPr>
+          <w:p>
+            <w:r>
+              <w:rPr>
+                <w:sz w:val="18"/>
+              </w:rPr>
+              <w:t>Menor a $20.000 ARS</w:t>
+            </w:r>
+          </w:p>
+        </w:tc>
+        <w:tc>
+          <w:tcPr>
+            <w:tcW w:type="dxa" w:w="2835"/>
+            <w:shd w:val="clear" w:color="auto" w:fill="F5F5F5"/>
+          </w:tcPr>
+          <w:p>
+            <w:r>
+              <w:rPr>
+                <w:sz w:val="18"/>
+              </w:rPr>
+              <w:t>Mayor a $35.000 ARS → revisar landing y keywords</w:t>
+            </w:r>
+          </w:p>
+        </w:tc>
+      </w:tr>
+      <w:tr>
+        <w:tc>
+          <w:tcPr>
+            <w:tcW w:type="dxa" w:w="2268"/>
+          </w:tcPr>
+          <w:p>
+            <w:r>
+              <w:rPr>
+                <w:sz w:val="18"/>
+              </w:rPr>
+              <w:t>Tasa de conversión (CVR)</w:t>
+            </w:r>
+          </w:p>
+        </w:tc>
+        <w:tc>
+          <w:tcPr>
+            <w:tcW w:type="dxa" w:w="3402"/>
+          </w:tcPr>
+          <w:p>
+            <w:r>
+              <w:rPr>
+                <w:sz w:val="18"/>
+              </w:rPr>
+              <w:t>Conversiones ÷ clics × 100</w:t>
+            </w:r>
+          </w:p>
+        </w:tc>
+        <w:tc>
+          <w:tcPr>
+            <w:tcW w:type="dxa" w:w="2268"/>
+          </w:tcPr>
+          <w:p>
+            <w:r>
+              <w:rPr>
+                <w:sz w:val="18"/>
+              </w:rPr>
+              <w:t>Mayor a 3%</w:t>
+            </w:r>
+          </w:p>
+        </w:tc>
+        <w:tc>
+          <w:tcPr>
+            <w:tcW w:type="dxa" w:w="2835"/>
+          </w:tcPr>
+          <w:p>
+            <w:r>
+              <w:rPr>
+                <w:sz w:val="18"/>
+              </w:rPr>
+              <w:t>Menor a 1,5% → problema en la landing page</w:t>
+            </w:r>
+          </w:p>
+        </w:tc>
+      </w:tr>
+      <w:tr>
+        <w:tc>
+          <w:tcPr>
+            <w:tcW w:type="dxa" w:w="2268"/>
+            <w:shd w:val="clear" w:color="auto" w:fill="F5F5F5"/>
+          </w:tcPr>
+          <w:p>
+            <w:r>
+              <w:rPr>
+                <w:sz w:val="18"/>
+              </w:rPr>
+              <w:t>Volumen de leads mensuales</w:t>
+            </w:r>
+          </w:p>
+        </w:tc>
+        <w:tc>
+          <w:tcPr>
+            <w:tcW w:type="dxa" w:w="3402"/>
+            <w:shd w:val="clear" w:color="auto" w:fill="F5F5F5"/>
+          </w:tcPr>
+          <w:p>
+            <w:r>
+              <w:rPr>
+                <w:sz w:val="18"/>
+              </w:rPr>
+              <w:t>Total de formularios enviados + clics a WhatsApp</w:t>
+            </w:r>
+          </w:p>
+        </w:tc>
+        <w:tc>
+          <w:tcPr>
+            <w:tcW w:type="dxa" w:w="2268"/>
+            <w:shd w:val="clear" w:color="auto" w:fill="F5F5F5"/>
+          </w:tcPr>
+          <w:p>
+            <w:r>
+              <w:rPr>
+                <w:sz w:val="18"/>
+              </w:rPr>
+              <w:t>Mínimo 30 leads/mes (todas las campañas)</w:t>
+            </w:r>
+          </w:p>
+        </w:tc>
+        <w:tc>
+          <w:tcPr>
+            <w:tcW w:type="dxa" w:w="2835"/>
+            <w:shd w:val="clear" w:color="auto" w:fill="F5F5F5"/>
+          </w:tcPr>
+          <w:p>
+            <w:r>
+              <w:rPr>
+                <w:sz w:val="18"/>
+              </w:rPr>
+              <w:t>Menos de 15 leads → revisar presupuesto o keywords</w:t>
+            </w:r>
+          </w:p>
+        </w:tc>
+      </w:tr>
+      <w:tr>
+        <w:tc>
+          <w:tcPr>
+            <w:tcW w:type="dxa" w:w="2268"/>
+          </w:tcPr>
+          <w:p>
+            <w:r>
+              <w:rPr>
+                <w:sz w:val="18"/>
+              </w:rPr>
+              <w:t>Calidad del lead</w:t>
+            </w:r>
+          </w:p>
+        </w:tc>
+        <w:tc>
+          <w:tcPr>
+            <w:tcW w:type="dxa" w:w="3402"/>
+          </w:tcPr>
+          <w:p>
+            <w:r>
+              <w:rPr>
+                <w:sz w:val="18"/>
+              </w:rPr>
+              <w:t>% de leads que avanzan a cotización formal</w:t>
+            </w:r>
+          </w:p>
+        </w:tc>
+        <w:tc>
+          <w:tcPr>
+            <w:tcW w:type="dxa" w:w="2268"/>
+          </w:tcPr>
+          <w:p>
+            <w:r>
+              <w:rPr>
+                <w:sz w:val="18"/>
+              </w:rPr>
+              <w:t>Mayor a 40%</w:t>
+            </w:r>
+          </w:p>
+        </w:tc>
+        <w:tc>
+          <w:tcPr>
+            <w:tcW w:type="dxa" w:w="2835"/>
+          </w:tcPr>
+          <w:p>
+            <w:r>
+              <w:rPr>
+                <w:sz w:val="18"/>
+              </w:rPr>
+              <w:t>Menor a 20% → keywords demasiado amplias</w:t>
+            </w:r>
+          </w:p>
+        </w:tc>
+      </w:tr>
+      <w:tr>
+        <w:tc>
+          <w:tcPr>
+            <w:tcW w:type="dxa" w:w="2268"/>
+            <w:shd w:val="clear" w:color="auto" w:fill="F5F5F5"/>
+          </w:tcPr>
+          <w:p>
+            <w:r>
+              <w:rPr>
+                <w:sz w:val="18"/>
+              </w:rPr>
+              <w:t>ROAS (implícito)</w:t>
+            </w:r>
+          </w:p>
+        </w:tc>
+        <w:tc>
+          <w:tcPr>
+            <w:tcW w:type="dxa" w:w="3402"/>
+            <w:shd w:val="clear" w:color="auto" w:fill="F5F5F5"/>
+          </w:tcPr>
+          <w:p>
+            <w:r>
+              <w:rPr>
+                <w:sz w:val="18"/>
+              </w:rPr>
+              <w:t>Valor generado por las campañas vs. inversión publicitaria</w:t>
+            </w:r>
+          </w:p>
+        </w:tc>
+        <w:tc>
+          <w:tcPr>
+            <w:tcW w:type="dxa" w:w="2268"/>
+            <w:shd w:val="clear" w:color="auto" w:fill="F5F5F5"/>
+          </w:tcPr>
+          <w:p>
+            <w:r>
+              <w:rPr>
+                <w:sz w:val="18"/>
+              </w:rPr>
+              <w:t>Positivo con el primer cierre del mes</w:t>
+            </w:r>
+          </w:p>
+        </w:tc>
+        <w:tc>
+          <w:tcPr>
+            <w:tcW w:type="dxa" w:w="2835"/>
+            <w:shd w:val="clear" w:color="auto" w:fill="F5F5F5"/>
+          </w:tcPr>
+          <w:p>
+            <w:r>
+              <w:rPr>
+                <w:sz w:val="18"/>
+              </w:rPr>
+              <w:t>Sin cierres en 60 días → revisar proceso de ventas</w:t>
+            </w:r>
+          </w:p>
+        </w:tc>
+      </w:tr>
+    </w:tbl>
+    <w:p/>
+    <w:p>
+      <w:pPr>
+        <w:spacing w:before="280" w:after="60"/>
+      </w:pPr>
+      <w:r>
+        <w:rPr>
+          <w:b/>
+          <w:color w:val="505050"/>
+          <w:sz w:val="26"/>
+        </w:rPr>
+        <w:t>12.2  KPIs secundarios — Diagnóstico de rendimiento</w:t>
+      </w:r>
+    </w:p>
+    <w:tbl>
+      <w:tblPr>
+        <w:tblStyle w:val="Tablaconcuadrcula"/>
+        <w:tblW w:type="auto" w:w="0"/>
+        <w:jc w:val="left"/>
+        <w:tblLook w:firstColumn="1" w:firstRow="1" w:lastColumn="0" w:lastRow="0" w:noHBand="0" w:noVBand="1" w:val="04A0"/>
+      </w:tblPr>
+      <w:tblGrid>
+        <w:gridCol w:w="2351"/>
+        <w:gridCol w:w="2351"/>
+        <w:gridCol w:w="2351"/>
+        <w:gridCol w:w="2351"/>
+      </w:tblGrid>
+      <w:tr>
+        <w:tc>
+          <w:tcPr>
+            <w:tcW w:type="dxa" w:w="2268"/>
+            <w:shd w:val="clear" w:color="auto" w:fill="505050"/>
+          </w:tcPr>
+          <w:p>
+            <w:pPr>
+              <w:jc w:val="center"/>
+            </w:pPr>
+            <w:r>
+              <w:rPr>
+                <w:b/>
+                <w:color w:val="FFFFFF"/>
+                <w:sz w:val="18"/>
+              </w:rPr>
+              <w:t>KPI</w:t>
+            </w:r>
+          </w:p>
+        </w:tc>
+        <w:tc>
+          <w:tcPr>
+            <w:tcW w:type="dxa" w:w="2835"/>
+            <w:shd w:val="clear" w:color="auto" w:fill="505050"/>
+          </w:tcPr>
+          <w:p>
+            <w:pPr>
+              <w:jc w:val="center"/>
+            </w:pPr>
+            <w:r>
+              <w:rPr>
+                <w:b/>
+                <w:color w:val="FFFFFF"/>
+                <w:sz w:val="18"/>
+              </w:rPr>
+              <w:t>Definición</w:t>
+            </w:r>
+          </w:p>
+        </w:tc>
+        <w:tc>
+          <w:tcPr>
+            <w:tcW w:type="dxa" w:w="1701"/>
+            <w:shd w:val="clear" w:color="auto" w:fill="505050"/>
+          </w:tcPr>
+          <w:p>
+            <w:pPr>
+              <w:jc w:val="center"/>
+            </w:pPr>
+            <w:r>
+              <w:rPr>
+                <w:b/>
+                <w:color w:val="FFFFFF"/>
+                <w:sz w:val="18"/>
+              </w:rPr>
+              <w:t>Rango saludable</w:t>
+            </w:r>
+          </w:p>
+        </w:tc>
+        <w:tc>
+          <w:tcPr>
+            <w:tcW w:type="dxa" w:w="3402"/>
+            <w:shd w:val="clear" w:color="auto" w:fill="505050"/>
+          </w:tcPr>
+          <w:p>
+            <w:pPr>
+              <w:jc w:val="center"/>
+            </w:pPr>
+            <w:r>
+              <w:rPr>
+                <w:b/>
+                <w:color w:val="FFFFFF"/>
+                <w:sz w:val="18"/>
+              </w:rPr>
+              <w:t>Qué indica si está fuera de rango</w:t>
+            </w:r>
+          </w:p>
+        </w:tc>
+      </w:tr>
+      <w:tr>
+        <w:tc>
+          <w:tcPr>
+            <w:tcW w:type="dxa" w:w="2268"/>
+            <w:shd w:val="clear" w:color="auto" w:fill="F5F5F5"/>
+          </w:tcPr>
+          <w:p>
+            <w:r>
+              <w:rPr>
+                <w:sz w:val="18"/>
+              </w:rPr>
+              <w:t>CTR (Click-Through Rate)</w:t>
+            </w:r>
+          </w:p>
+        </w:tc>
+        <w:tc>
+          <w:tcPr>
+            <w:tcW w:type="dxa" w:w="2835"/>
+            <w:shd w:val="clear" w:color="auto" w:fill="F5F5F5"/>
+          </w:tcPr>
+          <w:p>
+            <w:r>
+              <w:rPr>
+                <w:sz w:val="18"/>
+              </w:rPr>
+              <w:t>Clics ÷ impresiones × 100</w:t>
+            </w:r>
+          </w:p>
+        </w:tc>
+        <w:tc>
+          <w:tcPr>
+            <w:tcW w:type="dxa" w:w="1701"/>
+            <w:shd w:val="clear" w:color="auto" w:fill="F5F5F5"/>
+          </w:tcPr>
+          <w:p>
+            <w:r>
+              <w:rPr>
+                <w:sz w:val="18"/>
+              </w:rPr>
+              <w:t>3% – 7%</w:t>
+            </w:r>
+          </w:p>
+        </w:tc>
+        <w:tc>
+          <w:tcPr>
+            <w:tcW w:type="dxa" w:w="3402"/>
+            <w:shd w:val="clear" w:color="auto" w:fill="F5F5F5"/>
+          </w:tcPr>
+          <w:p>
+            <w:r>
+              <w:rPr>
+                <w:sz w:val="18"/>
+              </w:rPr>
+              <w:t>Bajo: anuncio poco relevante o keywords muy amplias</w:t>
+              <w:br/>
+              <w:t>Alto pero sin conv.: landing con problema</w:t>
+            </w:r>
+          </w:p>
+        </w:tc>
+      </w:tr>
+      <w:tr>
+        <w:tc>
+          <w:tcPr>
+            <w:tcW w:type="dxa" w:w="2268"/>
+          </w:tcPr>
+          <w:p>
+            <w:r>
+              <w:rPr>
+                <w:sz w:val="18"/>
+              </w:rPr>
+              <w:t>CPC promedio</w:t>
+            </w:r>
+          </w:p>
+        </w:tc>
+        <w:tc>
+          <w:tcPr>
+            <w:tcW w:type="dxa" w:w="2835"/>
+          </w:tcPr>
+          <w:p>
+            <w:r>
+              <w:rPr>
+                <w:sz w:val="18"/>
+              </w:rPr>
+              <w:t>Costo total ÷ clics</w:t>
+            </w:r>
+          </w:p>
+        </w:tc>
+        <w:tc>
+          <w:tcPr>
+            <w:tcW w:type="dxa" w:w="1701"/>
+          </w:tcPr>
+          <w:p>
+            <w:r>
+              <w:rPr>
+                <w:sz w:val="18"/>
+              </w:rPr>
+              <w:t>$200 – $500 ARS</w:t>
+            </w:r>
+          </w:p>
+        </w:tc>
+        <w:tc>
+          <w:tcPr>
+            <w:tcW w:type="dxa" w:w="3402"/>
+          </w:tcPr>
+          <w:p>
+            <w:r>
+              <w:rPr>
+                <w:sz w:val="18"/>
+              </w:rPr>
+              <w:t>Alto: subasta competida, ajustar concordancias</w:t>
+              <w:br/>
+              <w:t>Muy bajo: alcance limitado, revisar pujas</w:t>
+            </w:r>
+          </w:p>
+        </w:tc>
+      </w:tr>
+      <w:tr>
+        <w:tc>
+          <w:tcPr>
+            <w:tcW w:type="dxa" w:w="2268"/>
+            <w:shd w:val="clear" w:color="auto" w:fill="F5F5F5"/>
+          </w:tcPr>
+          <w:p>
+            <w:r>
+              <w:rPr>
+                <w:sz w:val="18"/>
+              </w:rPr>
+              <w:t>Índice de calidad (Quality Score)</w:t>
+            </w:r>
+          </w:p>
+        </w:tc>
+        <w:tc>
+          <w:tcPr>
+            <w:tcW w:type="dxa" w:w="2835"/>
+            <w:shd w:val="clear" w:color="auto" w:fill="F5F5F5"/>
+          </w:tcPr>
+          <w:p>
+            <w:r>
+              <w:rPr>
+                <w:sz w:val="18"/>
+              </w:rPr>
+              <w:t>Score 1–10 de Google por keyword</w:t>
+            </w:r>
+          </w:p>
+        </w:tc>
+        <w:tc>
+          <w:tcPr>
+            <w:tcW w:type="dxa" w:w="1701"/>
+            <w:shd w:val="clear" w:color="auto" w:fill="F5F5F5"/>
+          </w:tcPr>
+          <w:p>
+            <w:r>
+              <w:rPr>
+                <w:sz w:val="18"/>
+              </w:rPr>
+              <w:t>6 o más</w:t>
+            </w:r>
+          </w:p>
+        </w:tc>
+        <w:tc>
+          <w:tcPr>
+            <w:tcW w:type="dxa" w:w="3402"/>
+            <w:shd w:val="clear" w:color="auto" w:fill="F5F5F5"/>
+          </w:tcPr>
+          <w:p>
+            <w:r>
+              <w:rPr>
+                <w:sz w:val="18"/>
+              </w:rPr>
+              <w:t>Bajo: mejorar relevancia anuncio↔keyword↔landing</w:t>
+            </w:r>
+          </w:p>
+        </w:tc>
+      </w:tr>
+      <w:tr>
+        <w:tc>
+          <w:tcPr>
+            <w:tcW w:type="dxa" w:w="2268"/>
+          </w:tcPr>
+          <w:p>
+            <w:r>
+              <w:rPr>
+                <w:sz w:val="18"/>
+              </w:rPr>
+              <w:t>Impresiones</w:t>
+            </w:r>
+          </w:p>
+        </w:tc>
+        <w:tc>
+          <w:tcPr>
+            <w:tcW w:type="dxa" w:w="2835"/>
+          </w:tcPr>
+          <w:p>
+            <w:r>
+              <w:rPr>
+                <w:sz w:val="18"/>
+              </w:rPr>
+              <w:t>Veces que se mostró el anuncio</w:t>
+            </w:r>
+          </w:p>
+        </w:tc>
+        <w:tc>
+          <w:tcPr>
+            <w:tcW w:type="dxa" w:w="1701"/>
+          </w:tcPr>
+          <w:p>
+            <w:r>
+              <w:rPr>
+                <w:sz w:val="18"/>
+              </w:rPr>
+              <w:t>Creciente semana a semana</w:t>
+            </w:r>
+          </w:p>
+        </w:tc>
+        <w:tc>
+          <w:tcPr>
+            <w:tcW w:type="dxa" w:w="3402"/>
+          </w:tcPr>
+          <w:p>
+            <w:r>
+              <w:rPr>
+                <w:sz w:val="18"/>
+              </w:rPr>
+              <w:t>Caída brusca: keyword pausada, presupuesto agotado o baja de puja</w:t>
+            </w:r>
+          </w:p>
+        </w:tc>
+      </w:tr>
+      <w:tr>
+        <w:tc>
+          <w:tcPr>
+            <w:tcW w:type="dxa" w:w="2268"/>
+            <w:shd w:val="clear" w:color="auto" w:fill="F5F5F5"/>
+          </w:tcPr>
+          <w:p>
+            <w:r>
+              <w:rPr>
+                <w:sz w:val="18"/>
+              </w:rPr>
+              <w:t>Cuota de impresiones perdidas (presupuesto)</w:t>
+            </w:r>
+          </w:p>
+        </w:tc>
+        <w:tc>
+          <w:tcPr>
+            <w:tcW w:type="dxa" w:w="2835"/>
+            <w:shd w:val="clear" w:color="auto" w:fill="F5F5F5"/>
+          </w:tcPr>
+          <w:p>
+            <w:r>
+              <w:rPr>
+                <w:sz w:val="18"/>
+              </w:rPr>
+              <w:t>% de impresiones no obtenidas por falta de presupuesto</w:t>
+            </w:r>
+          </w:p>
+        </w:tc>
+        <w:tc>
+          <w:tcPr>
+            <w:tcW w:type="dxa" w:w="1701"/>
+            <w:shd w:val="clear" w:color="auto" w:fill="F5F5F5"/>
+          </w:tcPr>
+          <w:p>
+            <w:r>
+              <w:rPr>
+                <w:sz w:val="18"/>
+              </w:rPr>
+              <w:t>Menor a 20%</w:t>
+            </w:r>
+          </w:p>
+        </w:tc>
+        <w:tc>
+          <w:tcPr>
+            <w:tcW w:type="dxa" w:w="3402"/>
+            <w:shd w:val="clear" w:color="auto" w:fill="F5F5F5"/>
+          </w:tcPr>
+          <w:p>
+            <w:r>
+              <w:rPr>
+                <w:sz w:val="18"/>
+              </w:rPr>
+              <w:t>Alto: aumentar presupuesto diario o reducir keywords</w:t>
+            </w:r>
+          </w:p>
+        </w:tc>
+      </w:tr>
+      <w:tr>
+        <w:tc>
+          <w:tcPr>
+            <w:tcW w:type="dxa" w:w="2268"/>
+          </w:tcPr>
+          <w:p>
+            <w:r>
+              <w:rPr>
+                <w:sz w:val="18"/>
+              </w:rPr>
+              <w:t>Cuota de impresiones perdidas (ranking)</w:t>
+            </w:r>
+          </w:p>
+        </w:tc>
+        <w:tc>
+          <w:tcPr>
+            <w:tcW w:type="dxa" w:w="2835"/>
+          </w:tcPr>
+          <w:p>
+            <w:r>
+              <w:rPr>
+                <w:sz w:val="18"/>
+              </w:rPr>
+              <w:t>% de impresiones no obtenidas por bajo Ad Rank</w:t>
+            </w:r>
+          </w:p>
+        </w:tc>
+        <w:tc>
+          <w:tcPr>
+            <w:tcW w:type="dxa" w:w="1701"/>
+          </w:tcPr>
+          <w:p>
+            <w:r>
+              <w:rPr>
+                <w:sz w:val="18"/>
+              </w:rPr>
+              <w:t>Menor a 30%</w:t>
+            </w:r>
+          </w:p>
+        </w:tc>
+        <w:tc>
+          <w:tcPr>
+            <w:tcW w:type="dxa" w:w="3402"/>
+          </w:tcPr>
+          <w:p>
+            <w:r>
+              <w:rPr>
+                <w:sz w:val="18"/>
+              </w:rPr>
+              <w:t>Alto: mejorar Quality Score o subir CPC máximo</w:t>
+            </w:r>
+          </w:p>
+        </w:tc>
+      </w:tr>
+      <w:tr>
+        <w:tc>
+          <w:tcPr>
+            <w:tcW w:type="dxa" w:w="2268"/>
+            <w:shd w:val="clear" w:color="auto" w:fill="F5F5F5"/>
+          </w:tcPr>
+          <w:p>
+            <w:r>
+              <w:rPr>
+                <w:sz w:val="18"/>
+              </w:rPr>
+              <w:t>Tasa de rebote en landing</w:t>
+            </w:r>
+          </w:p>
+        </w:tc>
+        <w:tc>
+          <w:tcPr>
+            <w:tcW w:type="dxa" w:w="2835"/>
+            <w:shd w:val="clear" w:color="auto" w:fill="F5F5F5"/>
+          </w:tcPr>
+          <w:p>
+            <w:r>
+              <w:rPr>
+                <w:sz w:val="18"/>
+              </w:rPr>
+              <w:t>% de visitas que salen sin interactuar (GA4)</w:t>
+            </w:r>
+          </w:p>
+        </w:tc>
+        <w:tc>
+          <w:tcPr>
+            <w:tcW w:type="dxa" w:w="1701"/>
+            <w:shd w:val="clear" w:color="auto" w:fill="F5F5F5"/>
+          </w:tcPr>
+          <w:p>
+            <w:r>
+              <w:rPr>
+                <w:sz w:val="18"/>
+              </w:rPr>
+              <w:t>Menor a 55%</w:t>
+            </w:r>
+          </w:p>
+        </w:tc>
+        <w:tc>
+          <w:tcPr>
+            <w:tcW w:type="dxa" w:w="3402"/>
+            <w:shd w:val="clear" w:color="auto" w:fill="F5F5F5"/>
+          </w:tcPr>
+          <w:p>
+            <w:r>
+              <w:rPr>
+                <w:sz w:val="18"/>
+              </w:rPr>
+              <w:t>Alta: landing no coincide con la promesa del anuncio</w:t>
+            </w:r>
+          </w:p>
+        </w:tc>
+      </w:tr>
+      <w:tr>
+        <w:tc>
+          <w:tcPr>
+            <w:tcW w:type="dxa" w:w="2268"/>
+          </w:tcPr>
+          <w:p>
+            <w:r>
+              <w:rPr>
+                <w:sz w:val="18"/>
+              </w:rPr>
+              <w:t>Tiempo en landing</w:t>
+            </w:r>
+          </w:p>
+        </w:tc>
+        <w:tc>
+          <w:tcPr>
+            <w:tcW w:type="dxa" w:w="2835"/>
+          </w:tcPr>
+          <w:p>
+            <w:r>
+              <w:rPr>
+                <w:sz w:val="18"/>
+              </w:rPr>
+              <w:t>Duración promedio de sesión en la página (GA4)</w:t>
+            </w:r>
+          </w:p>
+        </w:tc>
+        <w:tc>
+          <w:tcPr>
+            <w:tcW w:type="dxa" w:w="1701"/>
+          </w:tcPr>
+          <w:p>
+            <w:r>
+              <w:rPr>
+                <w:sz w:val="18"/>
+              </w:rPr>
+              <w:t>Mayor a 60 segundos</w:t>
+            </w:r>
+          </w:p>
+        </w:tc>
+        <w:tc>
+          <w:tcPr>
+            <w:tcW w:type="dxa" w:w="3402"/>
+          </w:tcPr>
+          <w:p>
+            <w:r>
+              <w:rPr>
+                <w:sz w:val="18"/>
+              </w:rPr>
+              <w:t>Bajo: contenido no engancha, revisar estructura de la LP</w:t>
+            </w:r>
+          </w:p>
+        </w:tc>
+      </w:tr>
+    </w:tbl>
+    <w:p/>
+    <w:p/>
+    <w:p>
+      <w:pPr>
+        <w:spacing w:before="280" w:after="60"/>
+      </w:pPr>
+      <w:r>
+        <w:rPr>
+          <w:b/>
+          <w:color w:val="505050"/>
+          <w:sz w:val="26"/>
+        </w:rPr>
+        <w:t>12.3  Objetivos por campaña</w:t>
+      </w:r>
+    </w:p>
+    <w:tbl>
+      <w:tblPr>
+        <w:tblStyle w:val="Tablaconcuadrcula"/>
+        <w:tblW w:type="auto" w:w="0"/>
+        <w:jc w:val="left"/>
+        <w:tblLook w:firstColumn="1" w:firstRow="1" w:lastColumn="0" w:lastRow="0" w:noHBand="0" w:noVBand="1" w:val="04A0"/>
+      </w:tblPr>
+      <w:tblGrid>
+        <w:gridCol w:w="1881"/>
+        <w:gridCol w:w="1881"/>
+        <w:gridCol w:w="1881"/>
+        <w:gridCol w:w="1881"/>
+        <w:gridCol w:w="1881"/>
+      </w:tblGrid>
+      <w:tr>
+        <w:tc>
+          <w:tcPr>
+            <w:tcW w:type="dxa" w:w="2835"/>
+            <w:shd w:val="clear" w:color="auto" w:fill="505050"/>
+          </w:tcPr>
+          <w:p>
+            <w:pPr>
+              <w:jc w:val="center"/>
+            </w:pPr>
+            <w:r>
+              <w:rPr>
+                <w:b/>
+                <w:color w:val="FFFFFF"/>
+                <w:sz w:val="18"/>
+              </w:rPr>
+              <w:t>Campaña</w:t>
+            </w:r>
+          </w:p>
+        </w:tc>
+        <w:tc>
+          <w:tcPr>
+            <w:tcW w:type="dxa" w:w="2268"/>
+            <w:shd w:val="clear" w:color="auto" w:fill="505050"/>
+          </w:tcPr>
+          <w:p>
+            <w:pPr>
+              <w:jc w:val="center"/>
+            </w:pPr>
+            <w:r>
+              <w:rPr>
+                <w:b/>
+                <w:color w:val="FFFFFF"/>
+                <w:sz w:val="18"/>
+              </w:rPr>
+              <w:t>CPL objetivo</w:t>
+            </w:r>
+          </w:p>
+        </w:tc>
+        <w:tc>
+          <w:tcPr>
+            <w:tcW w:type="dxa" w:w="2268"/>
+            <w:shd w:val="clear" w:color="auto" w:fill="505050"/>
+          </w:tcPr>
+          <w:p>
+            <w:pPr>
+              <w:jc w:val="center"/>
+            </w:pPr>
+            <w:r>
+              <w:rPr>
+                <w:b/>
+                <w:color w:val="FFFFFF"/>
+                <w:sz w:val="18"/>
+              </w:rPr>
+              <w:t>CVR objetivo</w:t>
+            </w:r>
+          </w:p>
+        </w:tc>
+        <w:tc>
+          <w:tcPr>
+            <w:tcW w:type="dxa" w:w="2268"/>
+            <w:shd w:val="clear" w:color="auto" w:fill="505050"/>
+          </w:tcPr>
+          <w:p>
+            <w:pPr>
+              <w:jc w:val="center"/>
+            </w:pPr>
+            <w:r>
+              <w:rPr>
+                <w:b/>
+                <w:color w:val="FFFFFF"/>
+                <w:sz w:val="18"/>
+              </w:rPr>
+              <w:t>Leads/mes mínimo</w:t>
+            </w:r>
+          </w:p>
+        </w:tc>
+        <w:tc>
+          <w:tcPr>
+            <w:tcW w:type="dxa" w:w="2268"/>
+            <w:shd w:val="clear" w:color="auto" w:fill="505050"/>
+          </w:tcPr>
+          <w:p>
+            <w:pPr>
+              <w:jc w:val="center"/>
+            </w:pPr>
+            <w:r>
+              <w:rPr>
+                <w:b/>
+                <w:color w:val="FFFFFF"/>
+                <w:sz w:val="18"/>
+              </w:rPr>
+              <w:t>CPC máx.</w:t>
+            </w:r>
+          </w:p>
+        </w:tc>
+      </w:tr>
+      <w:tr>
+        <w:tc>
+          <w:tcPr>
+            <w:tcW w:type="dxa" w:w="2835"/>
+            <w:shd w:val="clear" w:color="auto" w:fill="F5F5F5"/>
+          </w:tcPr>
+          <w:p>
+            <w:r>
+              <w:rPr>
+                <w:sz w:val="18"/>
+              </w:rPr>
+              <w:t>HUENU HR1804 UV</w:t>
+            </w:r>
+          </w:p>
+        </w:tc>
+        <w:tc>
+          <w:tcPr>
+            <w:tcW w:type="dxa" w:w="2268"/>
+            <w:shd w:val="clear" w:color="auto" w:fill="F5F5F5"/>
+          </w:tcPr>
+          <w:p>
+            <w:r>
+              <w:rPr>
+                <w:sz w:val="18"/>
+              </w:rPr>
+              <w:t>≤ $25.000 ARS</w:t>
+            </w:r>
+          </w:p>
+        </w:tc>
+        <w:tc>
+          <w:tcPr>
+            <w:tcW w:type="dxa" w:w="2268"/>
+            <w:shd w:val="clear" w:color="auto" w:fill="F5F5F5"/>
+          </w:tcPr>
+          <w:p>
+            <w:r>
+              <w:rPr>
+                <w:sz w:val="18"/>
+              </w:rPr>
+              <w:t>≥ 3,0%</w:t>
+            </w:r>
+          </w:p>
+        </w:tc>
+        <w:tc>
+          <w:tcPr>
+            <w:tcW w:type="dxa" w:w="2268"/>
+            <w:shd w:val="clear" w:color="auto" w:fill="F5F5F5"/>
+          </w:tcPr>
+          <w:p>
+            <w:r>
+              <w:rPr>
+                <w:sz w:val="18"/>
+              </w:rPr>
+              <w:t>8</w:t>
+            </w:r>
+          </w:p>
+        </w:tc>
+        <w:tc>
+          <w:tcPr>
+            <w:tcW w:type="dxa" w:w="2268"/>
+            <w:shd w:val="clear" w:color="auto" w:fill="F5F5F5"/>
+          </w:tcPr>
+          <w:p>
+            <w:r>
+              <w:rPr>
+                <w:sz w:val="18"/>
+              </w:rPr>
+              <w:t>$450 ARS</w:t>
+            </w:r>
+          </w:p>
+        </w:tc>
+      </w:tr>
+      <w:tr>
+        <w:tc>
+          <w:tcPr>
+            <w:tcW w:type="dxa" w:w="2835"/>
+          </w:tcPr>
+          <w:p>
+            <w:r>
+              <w:rPr>
+                <w:sz w:val="18"/>
+              </w:rPr>
+              <w:t>HUENU HF-6090</w:t>
+            </w:r>
+          </w:p>
+        </w:tc>
+        <w:tc>
+          <w:tcPr>
+            <w:tcW w:type="dxa" w:w="2268"/>
+          </w:tcPr>
+          <w:p>
+            <w:r>
+              <w:rPr>
+                <w:sz w:val="18"/>
+              </w:rPr>
+              <w:t>≤ $22.000 ARS</w:t>
+            </w:r>
+          </w:p>
+        </w:tc>
+        <w:tc>
+          <w:tcPr>
+            <w:tcW w:type="dxa" w:w="2268"/>
+          </w:tcPr>
+          <w:p>
+            <w:r>
+              <w:rPr>
+                <w:sz w:val="18"/>
+              </w:rPr>
+              <w:t>≥ 3,5%</w:t>
+            </w:r>
+          </w:p>
+        </w:tc>
+        <w:tc>
+          <w:tcPr>
+            <w:tcW w:type="dxa" w:w="2268"/>
+          </w:tcPr>
+          <w:p>
+            <w:r>
+              <w:rPr>
+                <w:sz w:val="18"/>
+              </w:rPr>
+              <w:t>6</w:t>
+            </w:r>
+          </w:p>
+        </w:tc>
+        <w:tc>
+          <w:tcPr>
+            <w:tcW w:type="dxa" w:w="2268"/>
+          </w:tcPr>
+          <w:p>
+            <w:r>
+              <w:rPr>
+                <w:sz w:val="18"/>
+              </w:rPr>
+              <w:t>$380 ARS</w:t>
+            </w:r>
+          </w:p>
+        </w:tc>
+      </w:tr>
+      <w:tr>
+        <w:tc>
+          <w:tcPr>
+            <w:tcW w:type="dxa" w:w="2835"/>
+            <w:shd w:val="clear" w:color="auto" w:fill="F5F5F5"/>
+          </w:tcPr>
+          <w:p>
+            <w:r>
+              <w:rPr>
+                <w:sz w:val="18"/>
+              </w:rPr>
+              <w:t>Teneth FC7090</w:t>
+            </w:r>
+          </w:p>
+        </w:tc>
+        <w:tc>
+          <w:tcPr>
+            <w:tcW w:type="dxa" w:w="2268"/>
+            <w:shd w:val="clear" w:color="auto" w:fill="F5F5F5"/>
+          </w:tcPr>
+          <w:p>
+            <w:r>
+              <w:rPr>
+                <w:sz w:val="18"/>
+              </w:rPr>
+              <w:t>≤ $20.000 ARS</w:t>
+            </w:r>
+          </w:p>
+        </w:tc>
+        <w:tc>
+          <w:tcPr>
+            <w:tcW w:type="dxa" w:w="2268"/>
+            <w:shd w:val="clear" w:color="auto" w:fill="F5F5F5"/>
+          </w:tcPr>
+          <w:p>
+            <w:r>
+              <w:rPr>
+                <w:sz w:val="18"/>
+              </w:rPr>
+              <w:t>≥ 3,5%</w:t>
+            </w:r>
+          </w:p>
+        </w:tc>
+        <w:tc>
+          <w:tcPr>
+            <w:tcW w:type="dxa" w:w="2268"/>
+            <w:shd w:val="clear" w:color="auto" w:fill="F5F5F5"/>
+          </w:tcPr>
+          <w:p>
+            <w:r>
+              <w:rPr>
+                <w:sz w:val="18"/>
+              </w:rPr>
+              <w:t>5</w:t>
+            </w:r>
+          </w:p>
+        </w:tc>
+        <w:tc>
+          <w:tcPr>
+            <w:tcW w:type="dxa" w:w="2268"/>
+            <w:shd w:val="clear" w:color="auto" w:fill="F5F5F5"/>
+          </w:tcPr>
+          <w:p>
+            <w:r>
+              <w:rPr>
+                <w:sz w:val="18"/>
+              </w:rPr>
+              <w:t>$320 ARS</w:t>
+            </w:r>
+          </w:p>
+        </w:tc>
+      </w:tr>
+      <w:tr>
+        <w:tc>
+          <w:tcPr>
+            <w:tcW w:type="dxa" w:w="2835"/>
+          </w:tcPr>
+          <w:p>
+            <w:r>
+              <w:rPr>
+                <w:sz w:val="18"/>
+              </w:rPr>
+              <w:t>KM Alquiler</w:t>
+            </w:r>
+          </w:p>
+        </w:tc>
+        <w:tc>
+          <w:tcPr>
+            <w:tcW w:type="dxa" w:w="2268"/>
+          </w:tcPr>
+          <w:p>
+            <w:r>
+              <w:rPr>
+                <w:sz w:val="18"/>
+              </w:rPr>
+              <w:t>≤ $28.000 ARS</w:t>
+            </w:r>
+          </w:p>
+        </w:tc>
+        <w:tc>
+          <w:tcPr>
+            <w:tcW w:type="dxa" w:w="2268"/>
+          </w:tcPr>
+          <w:p>
+            <w:r>
+              <w:rPr>
+                <w:sz w:val="18"/>
+              </w:rPr>
+              <w:t>≥ 2,5%</w:t>
+            </w:r>
+          </w:p>
+        </w:tc>
+        <w:tc>
+          <w:tcPr>
+            <w:tcW w:type="dxa" w:w="2268"/>
+          </w:tcPr>
+          <w:p>
+            <w:r>
+              <w:rPr>
+                <w:sz w:val="18"/>
+              </w:rPr>
+              <w:t>10</w:t>
+            </w:r>
+          </w:p>
+        </w:tc>
+        <w:tc>
+          <w:tcPr>
+            <w:tcW w:type="dxa" w:w="2268"/>
+          </w:tcPr>
+          <w:p>
+            <w:r>
+              <w:rPr>
+                <w:sz w:val="18"/>
+              </w:rPr>
+              <w:t>$500 ARS</w:t>
+            </w:r>
+          </w:p>
+        </w:tc>
+      </w:tr>
+    </w:tbl>
+    <w:p/>
+    <w:p>
+      <w:pPr>
+        <w:spacing w:after="40"/>
+      </w:pPr>
+      <w:r>
+        <w:rPr>
+          <w:b w:val="0"/>
+          <w:i/>
+          <w:sz w:val="20"/>
+        </w:rPr>
+        <w:t>Nota: el CPL más alto en KM Alquiler se justifica porque el ticket es recurrente (contrato mensual), no una compra única.</w:t>
+      </w:r>
+    </w:p>
+    <w:p/>
+    <w:p>
+      <w:pPr>
+        <w:spacing w:before="280" w:after="60"/>
+      </w:pPr>
+      <w:r>
+        <w:rPr>
+          <w:b/>
+          <w:color w:val="505050"/>
+          <w:sz w:val="26"/>
+        </w:rPr>
+        <w:t>12.4  Frecuencia y agenda de revisión</w:t>
+      </w:r>
+    </w:p>
+    <w:tbl>
+      <w:tblPr>
+        <w:tblStyle w:val="Tablaconcuadrcula"/>
+        <w:tblW w:type="auto" w:w="0"/>
+        <w:jc w:val="left"/>
+        <w:tblLook w:firstColumn="1" w:firstRow="1" w:lastColumn="0" w:lastRow="0" w:noHBand="0" w:noVBand="1" w:val="04A0"/>
+      </w:tblPr>
+      <w:tblGrid>
+        <w:gridCol w:w="3135"/>
+        <w:gridCol w:w="3135"/>
+        <w:gridCol w:w="3135"/>
+      </w:tblGrid>
+      <w:tr>
+        <w:tc>
+          <w:tcPr>
+            <w:tcW w:type="dxa" w:w="1701"/>
+            <w:shd w:val="clear" w:color="auto" w:fill="505050"/>
+          </w:tcPr>
+          <w:p>
+            <w:pPr>
+              <w:jc w:val="center"/>
+            </w:pPr>
+            <w:r>
+              <w:rPr>
+                <w:b/>
+                <w:color w:val="FFFFFF"/>
+                <w:sz w:val="18"/>
+              </w:rPr>
+              <w:t>Frecuencia</w:t>
+            </w:r>
+          </w:p>
+        </w:tc>
+        <w:tc>
+          <w:tcPr>
+            <w:tcW w:type="dxa" w:w="4535"/>
+            <w:shd w:val="clear" w:color="auto" w:fill="505050"/>
+          </w:tcPr>
+          <w:p>
+            <w:pPr>
+              <w:jc w:val="center"/>
+            </w:pPr>
+            <w:r>
+              <w:rPr>
+                <w:b/>
+                <w:color w:val="FFFFFF"/>
+                <w:sz w:val="18"/>
+              </w:rPr>
+              <w:t>Qué revisar</w:t>
+            </w:r>
+          </w:p>
+        </w:tc>
+        <w:tc>
+          <w:tcPr>
+            <w:tcW w:type="dxa" w:w="3402"/>
+            <w:shd w:val="clear" w:color="auto" w:fill="505050"/>
+          </w:tcPr>
+          <w:p>
+            <w:pPr>
+              <w:jc w:val="center"/>
+            </w:pPr>
+            <w:r>
+              <w:rPr>
+                <w:b/>
+                <w:color w:val="FFFFFF"/>
+                <w:sz w:val="18"/>
+              </w:rPr>
+              <w:t>Acción posible</w:t>
+            </w:r>
+          </w:p>
+        </w:tc>
+      </w:tr>
+      <w:tr>
+        <w:tc>
+          <w:tcPr>
+            <w:tcW w:type="dxa" w:w="1701"/>
+            <w:shd w:val="clear" w:color="auto" w:fill="F5F5F5"/>
+          </w:tcPr>
+          <w:p>
+            <w:r>
+              <w:rPr>
+                <w:sz w:val="18"/>
+              </w:rPr>
+              <w:t>Diaria</w:t>
+              <w:br/>
+              <w:t>(5 min)</w:t>
+            </w:r>
+          </w:p>
+        </w:tc>
+        <w:tc>
+          <w:tcPr>
+            <w:tcW w:type="dxa" w:w="4535"/>
+            <w:shd w:val="clear" w:color="auto" w:fill="F5F5F5"/>
+          </w:tcPr>
+          <w:p>
+            <w:r>
+              <w:rPr>
+                <w:sz w:val="18"/>
+              </w:rPr>
+              <w:t>Gasto del día vs. presupuesto</w:t>
+              <w:br/>
+              <w:t>Alertas de conversiones</w:t>
+            </w:r>
+          </w:p>
+        </w:tc>
+        <w:tc>
+          <w:tcPr>
+            <w:tcW w:type="dxa" w:w="3402"/>
+            <w:shd w:val="clear" w:color="auto" w:fill="F5F5F5"/>
+          </w:tcPr>
+          <w:p>
+            <w:r>
+              <w:rPr>
+                <w:sz w:val="18"/>
+              </w:rPr>
+              <w:t>Ajustar presupuesto si se agota antes del mediodía</w:t>
+            </w:r>
+          </w:p>
+        </w:tc>
+      </w:tr>
+      <w:tr>
+        <w:tc>
+          <w:tcPr>
+            <w:tcW w:type="dxa" w:w="1701"/>
+          </w:tcPr>
+          <w:p>
+            <w:r>
+              <w:rPr>
+                <w:sz w:val="18"/>
+              </w:rPr>
+              <w:t>Semanal</w:t>
+              <w:br/>
+              <w:t>(30 min)</w:t>
+            </w:r>
+          </w:p>
+        </w:tc>
+        <w:tc>
+          <w:tcPr>
+            <w:tcW w:type="dxa" w:w="4535"/>
+          </w:tcPr>
+          <w:p>
+            <w:r>
+              <w:rPr>
+                <w:sz w:val="18"/>
+              </w:rPr>
+              <w:t>Search terms report</w:t>
+              <w:br/>
+              <w:t>Keywords con gasto sin conversión</w:t>
+              <w:br/>
+              <w:t>CTR y CPC por grupo de anuncio</w:t>
+              <w:br/>
+              <w:t>Nuevas negativas a agregar</w:t>
+            </w:r>
+          </w:p>
+        </w:tc>
+        <w:tc>
+          <w:tcPr>
+            <w:tcW w:type="dxa" w:w="3402"/>
+          </w:tcPr>
+          <w:p>
+            <w:r>
+              <w:rPr>
+                <w:sz w:val="18"/>
+              </w:rPr>
+              <w:t>Pausar keywords ineficientes</w:t>
+              <w:br/>
+              <w:t>Agregar negativas</w:t>
+              <w:br/>
+              <w:t>Ajustar CPCs por grupo</w:t>
+            </w:r>
+          </w:p>
+        </w:tc>
+      </w:tr>
+      <w:tr>
+        <w:tc>
+          <w:tcPr>
+            <w:tcW w:type="dxa" w:w="1701"/>
+            <w:shd w:val="clear" w:color="auto" w:fill="F5F5F5"/>
+          </w:tcPr>
+          <w:p>
+            <w:r>
+              <w:rPr>
+                <w:sz w:val="18"/>
+              </w:rPr>
+              <w:t>Quincenal</w:t>
+              <w:br/>
+              <w:t>(45 min)</w:t>
+            </w:r>
+          </w:p>
+        </w:tc>
+        <w:tc>
+          <w:tcPr>
+            <w:tcW w:type="dxa" w:w="4535"/>
+            <w:shd w:val="clear" w:color="auto" w:fill="F5F5F5"/>
+          </w:tcPr>
+          <w:p>
+            <w:r>
+              <w:rPr>
+                <w:sz w:val="18"/>
+              </w:rPr>
+              <w:t>CPL por campaña y grupo</w:t>
+              <w:br/>
+              <w:t>Tasa de conversión por landing</w:t>
+              <w:br/>
+              <w:t>Rendimiento de audiencias</w:t>
+              <w:br/>
+              <w:t>Comparación de variantes RSA</w:t>
+            </w:r>
+          </w:p>
+        </w:tc>
+        <w:tc>
+          <w:tcPr>
+            <w:tcW w:type="dxa" w:w="3402"/>
+            <w:shd w:val="clear" w:color="auto" w:fill="F5F5F5"/>
+          </w:tcPr>
+          <w:p>
+            <w:r>
+              <w:rPr>
+                <w:sz w:val="18"/>
+              </w:rPr>
+              <w:t>Pausar grupos con CPL muy alto</w:t>
+              <w:br/>
+              <w:t>Pausar títulos RSA de bajo rendimiento</w:t>
+              <w:br/>
+              <w:t>Ajustar pujas de audiencias</w:t>
+            </w:r>
+          </w:p>
+        </w:tc>
+      </w:tr>
+      <w:tr>
+        <w:tc>
+          <w:tcPr>
+            <w:tcW w:type="dxa" w:w="1701"/>
+          </w:tcPr>
+          <w:p>
+            <w:r>
+              <w:rPr>
+                <w:sz w:val="18"/>
+              </w:rPr>
+              <w:t>Mensual</w:t>
+              <w:br/>
+              <w:t>(60–90 min)</w:t>
+            </w:r>
+          </w:p>
+        </w:tc>
+        <w:tc>
+          <w:tcPr>
+            <w:tcW w:type="dxa" w:w="4535"/>
+          </w:tcPr>
+          <w:p>
+            <w:r>
+              <w:rPr>
+                <w:sz w:val="18"/>
+              </w:rPr>
+              <w:t>Informe completo de performance</w:t>
+              <w:br/>
+              <w:t>Comparación mes a mes</w:t>
+              <w:br/>
+              <w:t>Evaluación de fases de puja</w:t>
+              <w:br/>
+              <w:t>Revisión de presupuesto total</w:t>
+            </w:r>
+          </w:p>
+        </w:tc>
+        <w:tc>
+          <w:tcPr>
+            <w:tcW w:type="dxa" w:w="3402"/>
+          </w:tcPr>
+          <w:p>
+            <w:r>
+              <w:rPr>
+                <w:sz w:val="18"/>
+              </w:rPr>
+              <w:t>Reasignar presupuesto hacia campañas ganadoras</w:t>
+              <w:br/>
+              <w:t>Evaluar cambio de fase de puja</w:t>
+              <w:br/>
+              <w:t>Definir objetivos del mes siguiente</w:t>
+            </w:r>
+          </w:p>
+        </w:tc>
+      </w:tr>
+    </w:tbl>
+    <w:p/>
+    <w:p/>
+    <w:p>
+      <w:pPr>
+        <w:spacing w:before="280" w:after="60"/>
+      </w:pPr>
+      <w:r>
+        <w:rPr>
+          <w:b/>
+          <w:color w:val="505050"/>
+          <w:sz w:val="26"/>
+        </w:rPr>
+        <w:t>12.5  Semáforo de rendimiento</w:t>
+      </w:r>
+    </w:p>
+    <w:p>
+      <w:pPr>
+        <w:spacing w:after="40"/>
+      </w:pPr>
+      <w:r>
+        <w:rPr>
+          <w:b w:val="0"/>
+          <w:i w:val="0"/>
+          <w:sz w:val="20"/>
+        </w:rPr>
+        <w:t>Usá esta tabla para evaluar rápidamente el estado de cada campaña en la revisión semanal.</w:t>
+      </w:r>
+    </w:p>
+    <w:tbl>
+      <w:tblPr>
+        <w:tblStyle w:val="Tablaconcuadrcula"/>
+        <w:tblW w:type="auto" w:w="0"/>
+        <w:jc w:val="left"/>
+        <w:tblLook w:firstColumn="1" w:firstRow="1" w:lastColumn="0" w:lastRow="0" w:noHBand="0" w:noVBand="1" w:val="04A0"/>
+      </w:tblPr>
+      <w:tblGrid>
+        <w:gridCol w:w="2351"/>
+        <w:gridCol w:w="2351"/>
+        <w:gridCol w:w="2351"/>
+        <w:gridCol w:w="2351"/>
+      </w:tblGrid>
+      <w:tr>
+        <w:tc>
+          <w:tcPr>
+            <w:tcW w:type="dxa" w:w="2268"/>
+            <w:shd w:val="clear" w:color="auto" w:fill="505050"/>
+          </w:tcPr>
+          <w:p>
+            <w:pPr>
+              <w:jc w:val="center"/>
+            </w:pPr>
+            <w:r>
+              <w:rPr>
+                <w:b/>
+                <w:color w:val="FFFFFF"/>
+                <w:sz w:val="18"/>
+              </w:rPr>
+              <w:t>Métrica</w:t>
+            </w:r>
+          </w:p>
+        </w:tc>
+        <w:tc>
+          <w:tcPr>
+            <w:tcW w:type="dxa" w:w="2268"/>
+            <w:shd w:val="clear" w:color="auto" w:fill="505050"/>
+          </w:tcPr>
+          <w:p>
+            <w:pPr>
+              <w:jc w:val="center"/>
+            </w:pPr>
+            <w:r>
+              <w:rPr>
+                <w:b/>
+                <w:color w:val="FFFFFF"/>
+                <w:sz w:val="18"/>
+              </w:rPr>
+              <w:t>🟢 Saludable</w:t>
+            </w:r>
+          </w:p>
+        </w:tc>
+        <w:tc>
+          <w:tcPr>
+            <w:tcW w:type="dxa" w:w="2268"/>
+            <w:shd w:val="clear" w:color="auto" w:fill="505050"/>
+          </w:tcPr>
+          <w:p>
+            <w:pPr>
+              <w:jc w:val="center"/>
+            </w:pPr>
+            <w:r>
+              <w:rPr>
+                <w:b/>
+                <w:color w:val="FFFFFF"/>
+                <w:sz w:val="18"/>
+              </w:rPr>
+              <w:t>🟡 Atención</w:t>
+            </w:r>
+          </w:p>
+        </w:tc>
+        <w:tc>
+          <w:tcPr>
+            <w:tcW w:type="dxa" w:w="2835"/>
+            <w:shd w:val="clear" w:color="auto" w:fill="505050"/>
+          </w:tcPr>
+          <w:p>
+            <w:pPr>
+              <w:jc w:val="center"/>
+            </w:pPr>
+            <w:r>
+              <w:rPr>
+                <w:b/>
+                <w:color w:val="FFFFFF"/>
+                <w:sz w:val="18"/>
+              </w:rPr>
+              <w:t>🔴 Acción urgente</w:t>
+            </w:r>
+          </w:p>
+        </w:tc>
+      </w:tr>
+      <w:tr>
+        <w:tc>
+          <w:tcPr>
+            <w:tcW w:type="dxa" w:w="2268"/>
+            <w:shd w:val="clear" w:color="auto" w:fill="F5F5F5"/>
+          </w:tcPr>
+          <w:p>
+            <w:r>
+              <w:rPr>
+                <w:sz w:val="18"/>
+              </w:rPr>
+              <w:t>CTR</w:t>
+            </w:r>
+          </w:p>
+        </w:tc>
+        <w:tc>
+          <w:tcPr>
+            <w:tcW w:type="dxa" w:w="2268"/>
+            <w:shd w:val="clear" w:color="auto" w:fill="F5F5F5"/>
+          </w:tcPr>
+          <w:p>
+            <w:r>
+              <w:rPr>
+                <w:sz w:val="18"/>
+              </w:rPr>
+              <w:t>&gt; 5%</w:t>
+            </w:r>
+          </w:p>
+        </w:tc>
+        <w:tc>
+          <w:tcPr>
+            <w:tcW w:type="dxa" w:w="2268"/>
+            <w:shd w:val="clear" w:color="auto" w:fill="F5F5F5"/>
+          </w:tcPr>
+          <w:p>
+            <w:r>
+              <w:rPr>
+                <w:sz w:val="18"/>
+              </w:rPr>
+              <w:t>3% – 5%</w:t>
+            </w:r>
+          </w:p>
+        </w:tc>
+        <w:tc>
+          <w:tcPr>
+            <w:tcW w:type="dxa" w:w="2835"/>
+            <w:shd w:val="clear" w:color="auto" w:fill="F5F5F5"/>
+          </w:tcPr>
+          <w:p>
+            <w:r>
+              <w:rPr>
+                <w:sz w:val="18"/>
+              </w:rPr>
+              <w:t>&lt; 3%</w:t>
+            </w:r>
+          </w:p>
+        </w:tc>
+      </w:tr>
+      <w:tr>
+        <w:tc>
+          <w:tcPr>
+            <w:tcW w:type="dxa" w:w="2268"/>
+          </w:tcPr>
+          <w:p>
+            <w:r>
+              <w:rPr>
+                <w:sz w:val="18"/>
+              </w:rPr>
+              <w:t>CVR</w:t>
+            </w:r>
+          </w:p>
+        </w:tc>
+        <w:tc>
+          <w:tcPr>
+            <w:tcW w:type="dxa" w:w="2268"/>
+          </w:tcPr>
+          <w:p>
+            <w:r>
+              <w:rPr>
+                <w:sz w:val="18"/>
+              </w:rPr>
+              <w:t>&gt; 4%</w:t>
+            </w:r>
+          </w:p>
+        </w:tc>
+        <w:tc>
+          <w:tcPr>
+            <w:tcW w:type="dxa" w:w="2268"/>
+          </w:tcPr>
+          <w:p>
+            <w:r>
+              <w:rPr>
+                <w:sz w:val="18"/>
+              </w:rPr>
+              <w:t>2% – 4%</w:t>
+            </w:r>
+          </w:p>
+        </w:tc>
+        <w:tc>
+          <w:tcPr>
+            <w:tcW w:type="dxa" w:w="2835"/>
+          </w:tcPr>
+          <w:p>
+            <w:r>
+              <w:rPr>
+                <w:sz w:val="18"/>
+              </w:rPr>
+              <w:t>&lt; 2%</w:t>
+            </w:r>
+          </w:p>
+        </w:tc>
+      </w:tr>
+      <w:tr>
+        <w:tc>
+          <w:tcPr>
+            <w:tcW w:type="dxa" w:w="2268"/>
+            <w:shd w:val="clear" w:color="auto" w:fill="F5F5F5"/>
+          </w:tcPr>
+          <w:p>
+            <w:r>
+              <w:rPr>
+                <w:sz w:val="18"/>
+              </w:rPr>
+              <w:t>CPL</w:t>
+            </w:r>
+          </w:p>
+        </w:tc>
+        <w:tc>
+          <w:tcPr>
+            <w:tcW w:type="dxa" w:w="2268"/>
+            <w:shd w:val="clear" w:color="auto" w:fill="F5F5F5"/>
+          </w:tcPr>
+          <w:p>
+            <w:r>
+              <w:rPr>
+                <w:sz w:val="18"/>
+              </w:rPr>
+              <w:t>&lt; $18.000</w:t>
+            </w:r>
+          </w:p>
+        </w:tc>
+        <w:tc>
+          <w:tcPr>
+            <w:tcW w:type="dxa" w:w="2268"/>
+            <w:shd w:val="clear" w:color="auto" w:fill="F5F5F5"/>
+          </w:tcPr>
+          <w:p>
+            <w:r>
+              <w:rPr>
+                <w:sz w:val="18"/>
+              </w:rPr>
+              <w:t>$18k – $28k</w:t>
+            </w:r>
+          </w:p>
+        </w:tc>
+        <w:tc>
+          <w:tcPr>
+            <w:tcW w:type="dxa" w:w="2835"/>
+            <w:shd w:val="clear" w:color="auto" w:fill="F5F5F5"/>
+          </w:tcPr>
+          <w:p>
+            <w:r>
+              <w:rPr>
+                <w:sz w:val="18"/>
+              </w:rPr>
+              <w:t>&gt; $28.000 ARS</w:t>
+            </w:r>
+          </w:p>
+        </w:tc>
+      </w:tr>
+      <w:tr>
+        <w:tc>
+          <w:tcPr>
+            <w:tcW w:type="dxa" w:w="2268"/>
+          </w:tcPr>
+          <w:p>
+            <w:r>
+              <w:rPr>
+                <w:sz w:val="18"/>
+              </w:rPr>
+              <w:t>Quality Score</w:t>
+            </w:r>
+          </w:p>
+        </w:tc>
+        <w:tc>
+          <w:tcPr>
+            <w:tcW w:type="dxa" w:w="2268"/>
+          </w:tcPr>
+          <w:p>
+            <w:r>
+              <w:rPr>
+                <w:sz w:val="18"/>
+              </w:rPr>
+              <w:t>8 – 10</w:t>
+            </w:r>
+          </w:p>
+        </w:tc>
+        <w:tc>
+          <w:tcPr>
+            <w:tcW w:type="dxa" w:w="2268"/>
+          </w:tcPr>
+          <w:p>
+            <w:r>
+              <w:rPr>
+                <w:sz w:val="18"/>
+              </w:rPr>
+              <w:t>6 – 7</w:t>
+            </w:r>
+          </w:p>
+        </w:tc>
+        <w:tc>
+          <w:tcPr>
+            <w:tcW w:type="dxa" w:w="2835"/>
+          </w:tcPr>
+          <w:p>
+            <w:r>
+              <w:rPr>
+                <w:sz w:val="18"/>
+              </w:rPr>
+              <w:t>≤ 5</w:t>
+            </w:r>
+          </w:p>
+        </w:tc>
+      </w:tr>
+      <w:tr>
+        <w:tc>
+          <w:tcPr>
+            <w:tcW w:type="dxa" w:w="2268"/>
+            <w:shd w:val="clear" w:color="auto" w:fill="F5F5F5"/>
+          </w:tcPr>
+          <w:p>
+            <w:r>
+              <w:rPr>
+                <w:sz w:val="18"/>
+              </w:rPr>
+              <w:t>IS perdida (ppto)</w:t>
+            </w:r>
+          </w:p>
+        </w:tc>
+        <w:tc>
+          <w:tcPr>
+            <w:tcW w:type="dxa" w:w="2268"/>
+            <w:shd w:val="clear" w:color="auto" w:fill="F5F5F5"/>
+          </w:tcPr>
+          <w:p>
+            <w:r>
+              <w:rPr>
+                <w:sz w:val="18"/>
+              </w:rPr>
+              <w:t>&lt; 10%</w:t>
+            </w:r>
+          </w:p>
+        </w:tc>
+        <w:tc>
+          <w:tcPr>
+            <w:tcW w:type="dxa" w:w="2268"/>
+            <w:shd w:val="clear" w:color="auto" w:fill="F5F5F5"/>
+          </w:tcPr>
+          <w:p>
+            <w:r>
+              <w:rPr>
+                <w:sz w:val="18"/>
+              </w:rPr>
+              <w:t>10% – 25%</w:t>
+            </w:r>
+          </w:p>
+        </w:tc>
+        <w:tc>
+          <w:tcPr>
+            <w:tcW w:type="dxa" w:w="2835"/>
+            <w:shd w:val="clear" w:color="auto" w:fill="F5F5F5"/>
+          </w:tcPr>
+          <w:p>
+            <w:r>
+              <w:rPr>
+                <w:sz w:val="18"/>
+              </w:rPr>
+              <w:t>&gt; 25%</w:t>
+            </w:r>
+          </w:p>
+        </w:tc>
+      </w:tr>
+      <w:tr>
+        <w:tc>
+          <w:tcPr>
+            <w:tcW w:type="dxa" w:w="2268"/>
+          </w:tcPr>
+          <w:p>
+            <w:r>
+              <w:rPr>
+                <w:sz w:val="18"/>
+              </w:rPr>
+              <w:t>IS perdida (rank)</w:t>
+            </w:r>
+          </w:p>
+        </w:tc>
+        <w:tc>
+          <w:tcPr>
+            <w:tcW w:type="dxa" w:w="2268"/>
+          </w:tcPr>
+          <w:p>
+            <w:r>
+              <w:rPr>
+                <w:sz w:val="18"/>
+              </w:rPr>
+              <w:t>&lt; 20%</w:t>
+            </w:r>
+          </w:p>
+        </w:tc>
+        <w:tc>
+          <w:tcPr>
+            <w:tcW w:type="dxa" w:w="2268"/>
+          </w:tcPr>
+          <w:p>
+            <w:r>
+              <w:rPr>
+                <w:sz w:val="18"/>
+              </w:rPr>
+              <w:t>20% – 40%</w:t>
+            </w:r>
+          </w:p>
+        </w:tc>
+        <w:tc>
+          <w:tcPr>
+            <w:tcW w:type="dxa" w:w="2835"/>
+          </w:tcPr>
+          <w:p>
+            <w:r>
+              <w:rPr>
+                <w:sz w:val="18"/>
+              </w:rPr>
+              <w:t>&gt; 40%</w:t>
+            </w:r>
+          </w:p>
+        </w:tc>
+      </w:tr>
+      <w:tr>
+        <w:tc>
+          <w:tcPr>
+            <w:tcW w:type="dxa" w:w="2268"/>
+            <w:shd w:val="clear" w:color="auto" w:fill="F5F5F5"/>
+          </w:tcPr>
+          <w:p>
+            <w:r>
+              <w:rPr>
+                <w:sz w:val="18"/>
+              </w:rPr>
+              <w:t>Rebote landing</w:t>
+            </w:r>
+          </w:p>
+        </w:tc>
+        <w:tc>
+          <w:tcPr>
+            <w:tcW w:type="dxa" w:w="2268"/>
+            <w:shd w:val="clear" w:color="auto" w:fill="F5F5F5"/>
+          </w:tcPr>
+          <w:p>
+            <w:r>
+              <w:rPr>
+                <w:sz w:val="18"/>
+              </w:rPr>
+              <w:t>&lt; 45%</w:t>
+            </w:r>
+          </w:p>
+        </w:tc>
+        <w:tc>
+          <w:tcPr>
+            <w:tcW w:type="dxa" w:w="2268"/>
+            <w:shd w:val="clear" w:color="auto" w:fill="F5F5F5"/>
+          </w:tcPr>
+          <w:p>
+            <w:r>
+              <w:rPr>
+                <w:sz w:val="18"/>
+              </w:rPr>
+              <w:t>45% – 60%</w:t>
+            </w:r>
+          </w:p>
+        </w:tc>
+        <w:tc>
+          <w:tcPr>
+            <w:tcW w:type="dxa" w:w="2835"/>
+            <w:shd w:val="clear" w:color="auto" w:fill="F5F5F5"/>
+          </w:tcPr>
+          <w:p>
+            <w:r>
+              <w:rPr>
+                <w:sz w:val="18"/>
+              </w:rPr>
+              <w:t>&gt; 60%</w:t>
+            </w:r>
+          </w:p>
+        </w:tc>
+      </w:tr>
+      <w:tr>
+        <w:tc>
+          <w:tcPr>
+            <w:tcW w:type="dxa" w:w="2268"/>
+          </w:tcPr>
+          <w:p>
+            <w:r>
+              <w:rPr>
+                <w:sz w:val="18"/>
+              </w:rPr>
+              <w:t>Tiempo en landing</w:t>
+            </w:r>
+          </w:p>
+        </w:tc>
+        <w:tc>
+          <w:tcPr>
+            <w:tcW w:type="dxa" w:w="2268"/>
+          </w:tcPr>
+          <w:p>
+            <w:r>
+              <w:rPr>
+                <w:sz w:val="18"/>
+              </w:rPr>
+              <w:t>&gt; 90 seg.</w:t>
+            </w:r>
+          </w:p>
+        </w:tc>
+        <w:tc>
+          <w:tcPr>
+            <w:tcW w:type="dxa" w:w="2268"/>
+          </w:tcPr>
+          <w:p>
+            <w:r>
+              <w:rPr>
+                <w:sz w:val="18"/>
+              </w:rPr>
+              <w:t>60 – 90 seg.</w:t>
+            </w:r>
+          </w:p>
+        </w:tc>
+        <w:tc>
+          <w:tcPr>
+            <w:tcW w:type="dxa" w:w="2835"/>
+          </w:tcPr>
+          <w:p>
+            <w:r>
+              <w:rPr>
+                <w:sz w:val="18"/>
+              </w:rPr>
+              <w:t>&lt; 60 seg.</w:t>
+            </w:r>
+          </w:p>
+        </w:tc>
+      </w:tr>
+      <w:tr>
+        <w:tc>
+          <w:tcPr>
+            <w:tcW w:type="dxa" w:w="2268"/>
+            <w:shd w:val="clear" w:color="auto" w:fill="F5F5F5"/>
+          </w:tcPr>
+          <w:p>
+            <w:r>
+              <w:rPr>
+                <w:sz w:val="18"/>
+              </w:rPr>
+              <w:t>Leads/mes</w:t>
+            </w:r>
+          </w:p>
+        </w:tc>
+        <w:tc>
+          <w:tcPr>
+            <w:tcW w:type="dxa" w:w="2268"/>
+            <w:shd w:val="clear" w:color="auto" w:fill="F5F5F5"/>
+          </w:tcPr>
+          <w:p>
+            <w:r>
+              <w:rPr>
+                <w:sz w:val="18"/>
+              </w:rPr>
+              <w:t>&gt; objetivo</w:t>
+            </w:r>
+          </w:p>
+        </w:tc>
+        <w:tc>
+          <w:tcPr>
+            <w:tcW w:type="dxa" w:w="2268"/>
+            <w:shd w:val="clear" w:color="auto" w:fill="F5F5F5"/>
+          </w:tcPr>
+          <w:p>
+            <w:r>
+              <w:rPr>
+                <w:sz w:val="18"/>
+              </w:rPr>
+              <w:t>80% objetivo</w:t>
+            </w:r>
+          </w:p>
+        </w:tc>
+        <w:tc>
+          <w:tcPr>
+            <w:tcW w:type="dxa" w:w="2835"/>
+            <w:shd w:val="clear" w:color="auto" w:fill="F5F5F5"/>
+          </w:tcPr>
+          <w:p>
+            <w:r>
+              <w:rPr>
+                <w:sz w:val="18"/>
+              </w:rPr>
+              <w:t>&lt; 50% objetivo</w:t>
+            </w:r>
+          </w:p>
+        </w:tc>
+      </w:tr>
+    </w:tbl>
+    <w:p/>
+    <w:p/>
+    <w:p>
+      <w:pPr>
+        <w:spacing w:before="280" w:after="60"/>
+      </w:pPr>
+      <w:r>
+        <w:rPr>
+          <w:b/>
+          <w:color w:val="505050"/>
+          <w:sz w:val="26"/>
+        </w:rPr>
+        <w:t>12.6  Dashboard recomendado en Google Ads</w:t>
+      </w:r>
+    </w:p>
+    <w:p>
+      <w:pPr>
+        <w:spacing w:after="40"/>
+      </w:pPr>
+      <w:r>
+        <w:rPr>
+          <w:b w:val="0"/>
+          <w:i w:val="0"/>
+          <w:sz w:val="20"/>
+        </w:rPr>
+        <w:t>Configurá estas columnas en la vista de campañas para tener el semáforo visible de un vistazo:</w:t>
+      </w:r>
+    </w:p>
+    <w:p>
+      <w:pPr>
+        <w:spacing w:after="20"/>
+        <w:ind w:left="454"/>
+      </w:pPr>
+      <w:r>
+        <w:rPr>
+          <w:rFonts w:ascii="Courier New" w:hAnsi="Courier New"/>
+          <w:color w:val="2E2E2E"/>
+          <w:sz w:val="18"/>
+        </w:rPr>
+        <w:t>Columnas recomendadas — Vista campañas:</w:t>
+      </w:r>
+    </w:p>
+    <w:p>
+      <w:pPr>
+        <w:spacing w:after="20"/>
+        <w:ind w:left="454"/>
+      </w:pPr>
+      <w:r>
+        <w:rPr>
+          <w:rFonts w:ascii="Courier New" w:hAnsi="Courier New"/>
+          <w:color w:val="2E2E2E"/>
+          <w:sz w:val="18"/>
+        </w:rPr>
+        <w:t xml:space="preserve">  Impresiones · Clics · CTR · CPC prom. · Costo</w:t>
+      </w:r>
+    </w:p>
+    <w:p>
+      <w:pPr>
+        <w:spacing w:after="20"/>
+        <w:ind w:left="454"/>
+      </w:pPr>
+      <w:r>
+        <w:rPr>
+          <w:rFonts w:ascii="Courier New" w:hAnsi="Courier New"/>
+          <w:color w:val="2E2E2E"/>
+          <w:sz w:val="18"/>
+        </w:rPr>
+        <w:t xml:space="preserve">  Conversiones · Tasa de conv. · Costo por conv. (CPL)</w:t>
+      </w:r>
+    </w:p>
+    <w:p>
+      <w:pPr>
+        <w:spacing w:after="20"/>
+        <w:ind w:left="454"/>
+      </w:pPr>
+      <w:r>
+        <w:rPr>
+          <w:rFonts w:ascii="Courier New" w:hAnsi="Courier New"/>
+          <w:color w:val="2E2E2E"/>
+          <w:sz w:val="18"/>
+        </w:rPr>
+        <w:t xml:space="preserve">  Cuota IS perdida (presupuesto) · Cuota IS perdida (ranking)</w:t>
+      </w:r>
+    </w:p>
+    <w:p>
+      <w:pPr>
+        <w:spacing w:after="20"/>
+        <w:ind w:left="454"/>
+      </w:pPr>
+      <w:r>
+        <w:rPr>
+          <w:rFonts w:ascii="Courier New" w:hAnsi="Courier New"/>
+          <w:color w:val="2E2E2E"/>
+          <w:sz w:val="18"/>
+        </w:rPr>
+      </w:r>
+    </w:p>
+    <w:p>
+      <w:pPr>
+        <w:spacing w:after="20"/>
+        <w:ind w:left="454"/>
+      </w:pPr>
+      <w:r>
+        <w:rPr>
+          <w:rFonts w:ascii="Courier New" w:hAnsi="Courier New"/>
+          <w:color w:val="2E2E2E"/>
+          <w:sz w:val="18"/>
+        </w:rPr>
+        <w:t>Columnas recomendadas — Vista keywords:</w:t>
+      </w:r>
+    </w:p>
+    <w:p>
+      <w:pPr>
+        <w:spacing w:after="20"/>
+        <w:ind w:left="454"/>
+      </w:pPr>
+      <w:r>
+        <w:rPr>
+          <w:rFonts w:ascii="Courier New" w:hAnsi="Courier New"/>
+          <w:color w:val="2E2E2E"/>
+          <w:sz w:val="18"/>
+        </w:rPr>
+        <w:t xml:space="preserve">  Keyword · Concordancia · Clics · CTR · CPC · Conv.</w:t>
+      </w:r>
+    </w:p>
+    <w:p>
+      <w:pPr>
+        <w:spacing w:after="20"/>
+        <w:ind w:left="454"/>
+      </w:pPr>
+      <w:r>
+        <w:rPr>
+          <w:rFonts w:ascii="Courier New" w:hAnsi="Courier New"/>
+          <w:color w:val="2E2E2E"/>
+          <w:sz w:val="18"/>
+        </w:rPr>
+        <w:t xml:space="preserve">  Quality Score · Nivel de calidad del anuncio</w:t>
+      </w:r>
+    </w:p>
+    <w:p>
+      <w:pPr>
+        <w:spacing w:after="20"/>
+        <w:ind w:left="454"/>
+      </w:pPr>
+      <w:r>
+        <w:rPr>
+          <w:rFonts w:ascii="Courier New" w:hAnsi="Courier New"/>
+          <w:color w:val="2E2E2E"/>
+          <w:sz w:val="18"/>
+        </w:rPr>
+        <w:t xml:space="preserve">  Relevancia del anuncio · Experiencia en la página de destino</w:t>
+      </w:r>
+    </w:p>
+    <w:p/>
+    <w:p>
+      <w:pPr>
+        <w:spacing w:before="280" w:after="60"/>
+      </w:pPr>
+      <w:r>
+        <w:rPr>
+          <w:b/>
+          <w:color w:val="505050"/>
+          <w:sz w:val="26"/>
+        </w:rPr>
+        <w:t>12.7  Vinculación con Google Analytics 4 (GA4)</w:t>
+      </w:r>
+    </w:p>
+    <w:p>
+      <w:pPr>
+        <w:spacing w:after="40"/>
+      </w:pPr>
+      <w:r>
+        <w:rPr>
+          <w:b w:val="0"/>
+          <w:i w:val="0"/>
+          <w:sz w:val="20"/>
+        </w:rPr>
+        <w:t>Vincular Google Ads con GA4 permite ver el comportamiento en la landing después del clic.</w:t>
+      </w:r>
+    </w:p>
+    <w:tbl>
+      <w:tblPr>
+        <w:tblStyle w:val="Tablaconcuadrcula"/>
+        <w:tblW w:type="auto" w:w="0"/>
+        <w:jc w:val="left"/>
+        <w:tblLook w:firstColumn="1" w:firstRow="1" w:lastColumn="0" w:lastRow="0" w:noHBand="0" w:noVBand="1" w:val="04A0"/>
+      </w:tblPr>
+      <w:tblGrid>
+        <w:gridCol w:w="3135"/>
+        <w:gridCol w:w="3135"/>
+        <w:gridCol w:w="3135"/>
+      </w:tblGrid>
+      <w:tr>
+        <w:tc>
+          <w:tcPr>
+            <w:tcW w:type="dxa" w:w="2268"/>
+            <w:shd w:val="clear" w:color="auto" w:fill="505050"/>
+          </w:tcPr>
+          <w:p>
+            <w:pPr>
+              <w:jc w:val="center"/>
+            </w:pPr>
+            <w:r>
+              <w:rPr>
+                <w:b/>
+                <w:color w:val="FFFFFF"/>
+                <w:sz w:val="18"/>
+              </w:rPr>
+              <w:t>Métrica de GA4</w:t>
+            </w:r>
+          </w:p>
+        </w:tc>
+        <w:tc>
+          <w:tcPr>
+            <w:tcW w:type="dxa" w:w="2835"/>
+            <w:shd w:val="clear" w:color="auto" w:fill="505050"/>
+          </w:tcPr>
+          <w:p>
+            <w:pPr>
+              <w:jc w:val="center"/>
+            </w:pPr>
+            <w:r>
+              <w:rPr>
+                <w:b/>
+                <w:color w:val="FFFFFF"/>
+                <w:sz w:val="18"/>
+              </w:rPr>
+              <w:t>Dónde verla</w:t>
+            </w:r>
+          </w:p>
+        </w:tc>
+        <w:tc>
+          <w:tcPr>
+            <w:tcW w:type="dxa" w:w="4535"/>
+            <w:shd w:val="clear" w:color="auto" w:fill="505050"/>
+          </w:tcPr>
+          <w:p>
+            <w:pPr>
+              <w:jc w:val="center"/>
+            </w:pPr>
+            <w:r>
+              <w:rPr>
+                <w:b/>
+                <w:color w:val="FFFFFF"/>
+                <w:sz w:val="18"/>
+              </w:rPr>
+              <w:t>Para qué sirve en las campañas</w:t>
+            </w:r>
+          </w:p>
+        </w:tc>
+      </w:tr>
+      <w:tr>
+        <w:tc>
+          <w:tcPr>
+            <w:tcW w:type="dxa" w:w="2268"/>
+            <w:shd w:val="clear" w:color="auto" w:fill="F5F5F5"/>
+          </w:tcPr>
+          <w:p>
+            <w:r>
+              <w:rPr>
+                <w:sz w:val="18"/>
+              </w:rPr>
+              <w:t>Tasa de engagement</w:t>
+            </w:r>
+          </w:p>
+        </w:tc>
+        <w:tc>
+          <w:tcPr>
+            <w:tcW w:type="dxa" w:w="2835"/>
+            <w:shd w:val="clear" w:color="auto" w:fill="F5F5F5"/>
+          </w:tcPr>
+          <w:p>
+            <w:r>
+              <w:rPr>
+                <w:sz w:val="18"/>
+              </w:rPr>
+              <w:t>Adquisición → Google Ads</w:t>
+            </w:r>
+          </w:p>
+        </w:tc>
+        <w:tc>
+          <w:tcPr>
+            <w:tcW w:type="dxa" w:w="4535"/>
+            <w:shd w:val="clear" w:color="auto" w:fill="F5F5F5"/>
+          </w:tcPr>
+          <w:p>
+            <w:r>
+              <w:rPr>
+                <w:sz w:val="18"/>
+              </w:rPr>
+              <w:t>Comparar calidad de tráfico entre campañas</w:t>
+            </w:r>
+          </w:p>
+        </w:tc>
+      </w:tr>
+      <w:tr>
+        <w:tc>
+          <w:tcPr>
+            <w:tcW w:type="dxa" w:w="2268"/>
+          </w:tcPr>
+          <w:p>
+            <w:r>
+              <w:rPr>
+                <w:sz w:val="18"/>
+              </w:rPr>
+              <w:t>Tiempo de sesión</w:t>
+            </w:r>
+          </w:p>
+        </w:tc>
+        <w:tc>
+          <w:tcPr>
+            <w:tcW w:type="dxa" w:w="2835"/>
+          </w:tcPr>
+          <w:p>
+            <w:r>
+              <w:rPr>
+                <w:sz w:val="18"/>
+              </w:rPr>
+              <w:t>Adquisición → Google Ads</w:t>
+            </w:r>
+          </w:p>
+        </w:tc>
+        <w:tc>
+          <w:tcPr>
+            <w:tcW w:type="dxa" w:w="4535"/>
+          </w:tcPr>
+          <w:p>
+            <w:r>
+              <w:rPr>
+                <w:sz w:val="18"/>
+              </w:rPr>
+              <w:t>Detectar landings que no retienen al usuario</w:t>
+            </w:r>
+          </w:p>
+        </w:tc>
+      </w:tr>
+      <w:tr>
+        <w:tc>
+          <w:tcPr>
+            <w:tcW w:type="dxa" w:w="2268"/>
+            <w:shd w:val="clear" w:color="auto" w:fill="F5F5F5"/>
+          </w:tcPr>
+          <w:p>
+            <w:r>
+              <w:rPr>
+                <w:sz w:val="18"/>
+              </w:rPr>
+              <w:t>Páginas por sesión</w:t>
+            </w:r>
+          </w:p>
+        </w:tc>
+        <w:tc>
+          <w:tcPr>
+            <w:tcW w:type="dxa" w:w="2835"/>
+            <w:shd w:val="clear" w:color="auto" w:fill="F5F5F5"/>
+          </w:tcPr>
+          <w:p>
+            <w:r>
+              <w:rPr>
+                <w:sz w:val="18"/>
+              </w:rPr>
+              <w:t>Adquisición → Google Ads</w:t>
+            </w:r>
+          </w:p>
+        </w:tc>
+        <w:tc>
+          <w:tcPr>
+            <w:tcW w:type="dxa" w:w="4535"/>
+            <w:shd w:val="clear" w:color="auto" w:fill="F5F5F5"/>
+          </w:tcPr>
+          <w:p>
+            <w:r>
+              <w:rPr>
+                <w:sz w:val="18"/>
+              </w:rPr>
+              <w:t>Ver si el usuario navega más allá de la landing</w:t>
+            </w:r>
+          </w:p>
+        </w:tc>
+      </w:tr>
+      <w:tr>
+        <w:tc>
+          <w:tcPr>
+            <w:tcW w:type="dxa" w:w="2268"/>
+          </w:tcPr>
+          <w:p>
+            <w:r>
+              <w:rPr>
+                <w:sz w:val="18"/>
+              </w:rPr>
+              <w:t>Evento: form_submit</w:t>
+            </w:r>
+          </w:p>
+        </w:tc>
+        <w:tc>
+          <w:tcPr>
+            <w:tcW w:type="dxa" w:w="2835"/>
+          </w:tcPr>
+          <w:p>
+            <w:r>
+              <w:rPr>
+                <w:sz w:val="18"/>
+              </w:rPr>
+              <w:t>Eventos → form_submit</w:t>
+            </w:r>
+          </w:p>
+        </w:tc>
+        <w:tc>
+          <w:tcPr>
+            <w:tcW w:type="dxa" w:w="4535"/>
+          </w:tcPr>
+          <w:p>
+            <w:r>
+              <w:rPr>
+                <w:sz w:val="18"/>
+              </w:rPr>
+              <w:t>Confirmar que el formulario se registra en GA4</w:t>
+            </w:r>
+          </w:p>
+        </w:tc>
+      </w:tr>
+      <w:tr>
+        <w:tc>
+          <w:tcPr>
+            <w:tcW w:type="dxa" w:w="2268"/>
+            <w:shd w:val="clear" w:color="auto" w:fill="F5F5F5"/>
+          </w:tcPr>
+          <w:p>
+            <w:r>
+              <w:rPr>
+                <w:sz w:val="18"/>
+              </w:rPr>
+              <w:t>Evento: click_whatsapp</w:t>
+            </w:r>
+          </w:p>
+        </w:tc>
+        <w:tc>
+          <w:tcPr>
+            <w:tcW w:type="dxa" w:w="2835"/>
+            <w:shd w:val="clear" w:color="auto" w:fill="F5F5F5"/>
+          </w:tcPr>
+          <w:p>
+            <w:r>
+              <w:rPr>
+                <w:sz w:val="18"/>
+              </w:rPr>
+              <w:t>Eventos → click_whatsapp</w:t>
+            </w:r>
+          </w:p>
+        </w:tc>
+        <w:tc>
+          <w:tcPr>
+            <w:tcW w:type="dxa" w:w="4535"/>
+            <w:shd w:val="clear" w:color="auto" w:fill="F5F5F5"/>
+          </w:tcPr>
+          <w:p>
+            <w:r>
+              <w:rPr>
+                <w:sz w:val="18"/>
+              </w:rPr>
+              <w:t>Trackear clics a WhatsApp como conversión</w:t>
+            </w:r>
+          </w:p>
+        </w:tc>
+      </w:tr>
+      <w:tr>
+        <w:tc>
+          <w:tcPr>
+            <w:tcW w:type="dxa" w:w="2268"/>
+          </w:tcPr>
+          <w:p>
+            <w:r>
+              <w:rPr>
+                <w:sz w:val="18"/>
+              </w:rPr>
+              <w:t>Fuente/medio</w:t>
+            </w:r>
+          </w:p>
+        </w:tc>
+        <w:tc>
+          <w:tcPr>
+            <w:tcW w:type="dxa" w:w="2835"/>
+          </w:tcPr>
+          <w:p>
+            <w:r>
+              <w:rPr>
+                <w:sz w:val="18"/>
+              </w:rPr>
+              <w:t>Adquisición → Descripción general</w:t>
+            </w:r>
+          </w:p>
+        </w:tc>
+        <w:tc>
+          <w:tcPr>
+            <w:tcW w:type="dxa" w:w="4535"/>
+          </w:tcPr>
+          <w:p>
+            <w:r>
+              <w:rPr>
+                <w:sz w:val="18"/>
+              </w:rPr>
+              <w:t>Confirmar que el tráfico viene de google/cpc</w:t>
+            </w:r>
+          </w:p>
+        </w:tc>
+      </w:tr>
+    </w:tbl>
+    <w:p/>
+    <w:p/>
+    <w:p>
+      <w:pPr>
+        <w:spacing w:before="280" w:after="60"/>
+      </w:pPr>
+      <w:r>
+        <w:rPr>
+          <w:b/>
+          <w:color w:val="505050"/>
+          <w:sz w:val="26"/>
+        </w:rPr>
+        <w:t>12.8  Estructura del reporte mensual</w:t>
+      </w:r>
+    </w:p>
+    <w:p>
+      <w:pPr>
+        <w:spacing w:after="40"/>
+      </w:pPr>
+      <w:r>
+        <w:rPr>
+          <w:b w:val="0"/>
+          <w:i w:val="0"/>
+          <w:sz w:val="20"/>
+        </w:rPr>
+        <w:t>Modelo de reporte para compartir internamente o con el cliente.</w:t>
+      </w:r>
+    </w:p>
+    <w:tbl>
+      <w:tblPr>
+        <w:tblStyle w:val="Tablaconcuadrcula"/>
+        <w:tblW w:type="auto" w:w="0"/>
+        <w:jc w:val="left"/>
+        <w:tblLook w:firstColumn="1" w:firstRow="1" w:lastColumn="0" w:lastRow="0" w:noHBand="0" w:noVBand="1" w:val="04A0"/>
+      </w:tblPr>
+      <w:tblGrid>
+        <w:gridCol w:w="4703"/>
+        <w:gridCol w:w="4703"/>
+      </w:tblGrid>
+      <w:tr>
+        <w:tc>
+          <w:tcPr>
+            <w:tcW w:type="dxa" w:w="2835"/>
+            <w:shd w:val="clear" w:color="auto" w:fill="505050"/>
+          </w:tcPr>
+          <w:p>
+            <w:pPr>
+              <w:jc w:val="center"/>
+            </w:pPr>
+            <w:r>
+              <w:rPr>
+                <w:b/>
+                <w:color w:val="FFFFFF"/>
+                <w:sz w:val="18"/>
+              </w:rPr>
+              <w:t>Sección</w:t>
+            </w:r>
+          </w:p>
+        </w:tc>
+        <w:tc>
+          <w:tcPr>
+            <w:tcW w:type="dxa" w:w="6803"/>
+            <w:shd w:val="clear" w:color="auto" w:fill="505050"/>
+          </w:tcPr>
+          <w:p>
+            <w:pPr>
+              <w:jc w:val="center"/>
+            </w:pPr>
+            <w:r>
+              <w:rPr>
+                <w:b/>
+                <w:color w:val="FFFFFF"/>
+                <w:sz w:val="18"/>
+              </w:rPr>
+              <w:t>Contenido</w:t>
+            </w:r>
+          </w:p>
+        </w:tc>
+      </w:tr>
+      <w:tr>
+        <w:tc>
+          <w:tcPr>
+            <w:tcW w:type="dxa" w:w="2835"/>
+            <w:shd w:val="clear" w:color="auto" w:fill="F5F5F5"/>
+          </w:tcPr>
+          <w:p>
+            <w:r>
+              <w:rPr>
+                <w:sz w:val="18"/>
+              </w:rPr>
+              <w:t>Resumen ejecutivo</w:t>
+            </w:r>
+          </w:p>
+        </w:tc>
+        <w:tc>
+          <w:tcPr>
+            <w:tcW w:type="dxa" w:w="6803"/>
+            <w:shd w:val="clear" w:color="auto" w:fill="F5F5F5"/>
+          </w:tcPr>
+          <w:p>
+            <w:r>
+              <w:rPr>
+                <w:sz w:val="18"/>
+              </w:rPr>
+              <w:t>Inversión total · Leads generados · CPL promedio · Comparativa vs. mes anterior</w:t>
+            </w:r>
+          </w:p>
+        </w:tc>
+      </w:tr>
+      <w:tr>
+        <w:tc>
+          <w:tcPr>
+            <w:tcW w:type="dxa" w:w="2835"/>
+          </w:tcPr>
+          <w:p>
+            <w:r>
+              <w:rPr>
+                <w:sz w:val="18"/>
+              </w:rPr>
+              <w:t>Rendimiento por campaña</w:t>
+            </w:r>
+          </w:p>
+        </w:tc>
+        <w:tc>
+          <w:tcPr>
+            <w:tcW w:type="dxa" w:w="6803"/>
+          </w:tcPr>
+          <w:p>
+            <w:r>
+              <w:rPr>
+                <w:sz w:val="18"/>
+              </w:rPr>
+              <w:t>Tabla con CTR · CVR · CPL · Leads de cada campaña</w:t>
+            </w:r>
+          </w:p>
+        </w:tc>
+      </w:tr>
+      <w:tr>
+        <w:tc>
+          <w:tcPr>
+            <w:tcW w:type="dxa" w:w="2835"/>
+            <w:shd w:val="clear" w:color="auto" w:fill="F5F5F5"/>
+          </w:tcPr>
+          <w:p>
+            <w:r>
+              <w:rPr>
+                <w:sz w:val="18"/>
+              </w:rPr>
+              <w:t>Top keywords</w:t>
+            </w:r>
+          </w:p>
+        </w:tc>
+        <w:tc>
+          <w:tcPr>
+            <w:tcW w:type="dxa" w:w="6803"/>
+            <w:shd w:val="clear" w:color="auto" w:fill="F5F5F5"/>
+          </w:tcPr>
+          <w:p>
+            <w:r>
+              <w:rPr>
+                <w:sz w:val="18"/>
+              </w:rPr>
+              <w:t>10 keywords con mayor cantidad de conversiones</w:t>
+            </w:r>
+          </w:p>
+        </w:tc>
+      </w:tr>
+      <w:tr>
+        <w:tc>
+          <w:tcPr>
+            <w:tcW w:type="dxa" w:w="2835"/>
+          </w:tcPr>
+          <w:p>
+            <w:r>
+              <w:rPr>
+                <w:sz w:val="18"/>
+              </w:rPr>
+              <w:t>Keywords a revisar</w:t>
+            </w:r>
+          </w:p>
+        </w:tc>
+        <w:tc>
+          <w:tcPr>
+            <w:tcW w:type="dxa" w:w="6803"/>
+          </w:tcPr>
+          <w:p>
+            <w:r>
+              <w:rPr>
+                <w:sz w:val="18"/>
+              </w:rPr>
+              <w:t>Keywords con gasto alto y 0 conversiones → pausar o agregar negativas</w:t>
+            </w:r>
+          </w:p>
+        </w:tc>
+      </w:tr>
+      <w:tr>
+        <w:tc>
+          <w:tcPr>
+            <w:tcW w:type="dxa" w:w="2835"/>
+            <w:shd w:val="clear" w:color="auto" w:fill="F5F5F5"/>
+          </w:tcPr>
+          <w:p>
+            <w:r>
+              <w:rPr>
+                <w:sz w:val="18"/>
+              </w:rPr>
+              <w:t>Análisis de anuncios</w:t>
+            </w:r>
+          </w:p>
+        </w:tc>
+        <w:tc>
+          <w:tcPr>
+            <w:tcW w:type="dxa" w:w="6803"/>
+            <w:shd w:val="clear" w:color="auto" w:fill="F5F5F5"/>
+          </w:tcPr>
+          <w:p>
+            <w:r>
+              <w:rPr>
+                <w:sz w:val="18"/>
+              </w:rPr>
+              <w:t>Títulos y descripciones RSA con mejor y peor rendimiento</w:t>
+            </w:r>
+          </w:p>
+        </w:tc>
+      </w:tr>
+      <w:tr>
+        <w:tc>
+          <w:tcPr>
+            <w:tcW w:type="dxa" w:w="2835"/>
+          </w:tcPr>
+          <w:p>
+            <w:r>
+              <w:rPr>
+                <w:sz w:val="18"/>
+              </w:rPr>
+              <w:t>Audiencias</w:t>
+            </w:r>
+          </w:p>
+        </w:tc>
+        <w:tc>
+          <w:tcPr>
+            <w:tcW w:type="dxa" w:w="6803"/>
+          </w:tcPr>
+          <w:p>
+            <w:r>
+              <w:rPr>
+                <w:sz w:val="18"/>
+              </w:rPr>
+              <w:t>Segmentos con mejor CVR y ajustes de puja aplicados</w:t>
+            </w:r>
+          </w:p>
+        </w:tc>
+      </w:tr>
+      <w:tr>
+        <w:tc>
+          <w:tcPr>
+            <w:tcW w:type="dxa" w:w="2835"/>
+            <w:shd w:val="clear" w:color="auto" w:fill="F5F5F5"/>
+          </w:tcPr>
+          <w:p>
+            <w:r>
+              <w:rPr>
+                <w:sz w:val="18"/>
+              </w:rPr>
+              <w:t>Oportunidades</w:t>
+            </w:r>
+          </w:p>
+        </w:tc>
+        <w:tc>
+          <w:tcPr>
+            <w:tcW w:type="dxa" w:w="6803"/>
+            <w:shd w:val="clear" w:color="auto" w:fill="F5F5F5"/>
+          </w:tcPr>
+          <w:p>
+            <w:r>
+              <w:rPr>
+                <w:sz w:val="18"/>
+              </w:rPr>
+              <w:t>Búsquedas relevantes no cubiertas · Grupos de anuncio sugeridos</w:t>
+            </w:r>
+          </w:p>
+        </w:tc>
+      </w:tr>
+      <w:tr>
+        <w:tc>
+          <w:tcPr>
+            <w:tcW w:type="dxa" w:w="2835"/>
+          </w:tcPr>
+          <w:p>
+            <w:r>
+              <w:rPr>
+                <w:sz w:val="18"/>
+              </w:rPr>
+              <w:t>Próximos pasos</w:t>
+            </w:r>
+          </w:p>
+        </w:tc>
+        <w:tc>
+          <w:tcPr>
+            <w:tcW w:type="dxa" w:w="6803"/>
+          </w:tcPr>
+          <w:p>
+            <w:r>
+              <w:rPr>
+                <w:sz w:val="18"/>
+              </w:rPr>
+              <w:t>Acciones concretas para el mes siguiente con responsable y fecha</w:t>
+            </w:r>
+          </w:p>
+        </w:tc>
+      </w:tr>
+    </w:tbl>
+    <w:p/>
+    <w:p/>
+    <w:p>
+      <w:pPr>
+        <w:spacing w:after="40"/>
+      </w:pPr>
+      <w:r>
+        <w:rPr>
+          <w:b/>
+          <w:i w:val="0"/>
+          <w:sz w:val="20"/>
+        </w:rPr>
+        <w:t>Herramientas para generar el reporte:</w:t>
+      </w:r>
+    </w:p>
+    <w:p>
+      <w:pPr>
+        <w:pStyle w:val="Listaconvietas"/>
+        <w:spacing w:after="20"/>
+        <w:ind w:left="283"/>
+      </w:pPr>
+      <w:r>
+        <w:rPr>
+          <w:sz w:val="20"/>
+        </w:rPr>
+        <w:t>Google Ads → Informes → Informe personalizado</w:t>
+      </w:r>
+    </w:p>
+    <w:p>
+      <w:pPr>
+        <w:pStyle w:val="Listaconvietas"/>
+        <w:spacing w:after="20"/>
+        <w:ind w:left="283"/>
+      </w:pPr>
+      <w:r>
+        <w:rPr>
+          <w:sz w:val="20"/>
+        </w:rPr>
+        <w:t>Looker Studio (gratuito) — vincular Google Ads + GA4 en un dashboard visual</w:t>
+      </w:r>
+    </w:p>
+    <w:p>
+      <w:pPr>
+        <w:pStyle w:val="Listaconvietas"/>
+        <w:spacing w:after="20"/>
+        <w:ind w:left="283"/>
+      </w:pPr>
+      <w:r>
+        <w:rPr>
+          <w:sz w:val="20"/>
+        </w:rPr>
+        <w:t>Google Sheets con importación automática via Google Ads Scripts</w:t>
+      </w:r>
+    </w:p>
     <w:sectPr>
       <w:pgSz w:w="12240" w:h="15840"/>
       <w:pgMar w:top="1134" w:right="1417" w:bottom="1134" w:left="1417" w:header="720" w:footer="720" w:gutter="0"/>

</xml_diff>